<commit_message>
I added some EDA code
</commit_message>
<xml_diff>
--- a/doc_folder/Plan.docx
+++ b/doc_folder/Plan.docx
@@ -72,6 +72,42 @@
           <w:lang w:val="en-GB"/>
         </w:rPr>
       </w:pPr>
+      <w:r>
+        <w:rPr>
+          <w:b/>
+          <w:bCs/>
+          <w:highlight w:val="yellow"/>
+          <w:lang w:val="en-GB"/>
+        </w:rPr>
+        <w:t>"The analysis is based on ARCEP's 2025 5G QoS measurements conducted at habitation measurement points across 1,61</w:t>
+      </w:r>
+      <w:r>
+        <w:rPr>
+          <w:b/>
+          <w:bCs/>
+          <w:highlight w:val="yellow"/>
+          <w:lang w:val="en-GB"/>
+        </w:rPr>
+        <w:t>0</w:t>
+      </w:r>
+      <w:r>
+        <w:rPr>
+          <w:b/>
+          <w:bCs/>
+          <w:highlight w:val="yellow"/>
+          <w:lang w:val="en-GB"/>
+        </w:rPr>
+        <w:t xml:space="preserve"> metropolitan communes."</w:t>
+      </w:r>
+    </w:p>
+    <w:p>
+      <w:pPr>
+        <w:rPr>
+          <w:b/>
+          <w:bCs/>
+          <w:lang w:val="en-GB"/>
+        </w:rPr>
+      </w:pPr>
     </w:p>
     <w:p>
       <w:pPr>
@@ -117,13 +153,23 @@
           <w:lang w:val="en-GB"/>
         </w:rPr>
       </w:pPr>
-      <w:r>
-        <w:rPr>
-          <w:b/>
-          <w:bCs/>
-          <w:lang w:val="en-GB"/>
-        </w:rPr>
-        <w:t>So I propose we work in this exact order</w:t>
+      <w:proofErr w:type="gramStart"/>
+      <w:r>
+        <w:rPr>
+          <w:b/>
+          <w:bCs/>
+          <w:lang w:val="en-GB"/>
+        </w:rPr>
+        <w:t>So</w:t>
+      </w:r>
+      <w:proofErr w:type="gramEnd"/>
+      <w:r>
+        <w:rPr>
+          <w:b/>
+          <w:bCs/>
+          <w:lang w:val="en-GB"/>
+        </w:rPr>
+        <w:t xml:space="preserve"> I propose we work in this exact order</w:t>
       </w:r>
     </w:p>
     <w:p>
@@ -294,8 +340,13 @@
           <w:numId w:val="6"/>
         </w:numPr>
       </w:pPr>
-      <w:r>
-        <w:t xml:space="preserve">source </w:t>
+      <w:proofErr w:type="gramStart"/>
+      <w:r>
+        <w:t>source</w:t>
+      </w:r>
+      <w:proofErr w:type="gramEnd"/>
+      <w:r>
+        <w:t xml:space="preserve"> </w:t>
       </w:r>
     </w:p>
     <w:p>
@@ -305,8 +356,21 @@
           <w:numId w:val="6"/>
         </w:numPr>
       </w:pPr>
-      <w:r>
-        <w:t xml:space="preserve">acquisition method </w:t>
+      <w:proofErr w:type="gramStart"/>
+      <w:r>
+        <w:t>acquisition</w:t>
+      </w:r>
+      <w:proofErr w:type="gramEnd"/>
+      <w:r>
+        <w:t xml:space="preserve"> </w:t>
+      </w:r>
+      <w:proofErr w:type="spellStart"/>
+      <w:r>
+        <w:t>method</w:t>
+      </w:r>
+      <w:proofErr w:type="spellEnd"/>
+      <w:r>
+        <w:t xml:space="preserve"> </w:t>
       </w:r>
     </w:p>
     <w:p>
@@ -316,8 +380,13 @@
           <w:numId w:val="6"/>
         </w:numPr>
       </w:pPr>
-      <w:r>
-        <w:t xml:space="preserve">file/API </w:t>
+      <w:proofErr w:type="gramStart"/>
+      <w:r>
+        <w:t>file</w:t>
+      </w:r>
+      <w:proofErr w:type="gramEnd"/>
+      <w:r>
+        <w:t xml:space="preserve">/API </w:t>
       </w:r>
     </w:p>
     <w:p>
@@ -327,8 +396,15 @@
           <w:numId w:val="6"/>
         </w:numPr>
       </w:pPr>
-      <w:r>
-        <w:t xml:space="preserve">period </w:t>
+      <w:proofErr w:type="spellStart"/>
+      <w:proofErr w:type="gramStart"/>
+      <w:r>
+        <w:t>period</w:t>
+      </w:r>
+      <w:proofErr w:type="spellEnd"/>
+      <w:proofErr w:type="gramEnd"/>
+      <w:r>
+        <w:t xml:space="preserve"> </w:t>
       </w:r>
     </w:p>
     <w:p>
@@ -338,8 +414,15 @@
           <w:numId w:val="6"/>
         </w:numPr>
       </w:pPr>
-      <w:r>
-        <w:t xml:space="preserve">geographic scope </w:t>
+      <w:proofErr w:type="spellStart"/>
+      <w:proofErr w:type="gramStart"/>
+      <w:r>
+        <w:t>geographic</w:t>
+      </w:r>
+      <w:proofErr w:type="spellEnd"/>
+      <w:proofErr w:type="gramEnd"/>
+      <w:r>
+        <w:t xml:space="preserve"> scope </w:t>
       </w:r>
     </w:p>
     <w:p>
@@ -349,8 +432,15 @@
           <w:numId w:val="6"/>
         </w:numPr>
       </w:pPr>
-      <w:r>
-        <w:t xml:space="preserve">purpose </w:t>
+      <w:proofErr w:type="spellStart"/>
+      <w:proofErr w:type="gramStart"/>
+      <w:r>
+        <w:t>purpose</w:t>
+      </w:r>
+      <w:proofErr w:type="spellEnd"/>
+      <w:proofErr w:type="gramEnd"/>
+      <w:r>
+        <w:t xml:space="preserve"> </w:t>
       </w:r>
     </w:p>
     <w:p>
@@ -360,8 +450,13 @@
           <w:numId w:val="6"/>
         </w:numPr>
       </w:pPr>
-      <w:r>
-        <w:t xml:space="preserve">key identifier </w:t>
+      <w:proofErr w:type="gramStart"/>
+      <w:r>
+        <w:t>key</w:t>
+      </w:r>
+      <w:proofErr w:type="gramEnd"/>
+      <w:r>
+        <w:t xml:space="preserve"> identifier </w:t>
       </w:r>
     </w:p>
     <w:p>
@@ -371,29 +466,53 @@
           <w:numId w:val="6"/>
         </w:numPr>
       </w:pPr>
-      <w:r>
-        <w:t xml:space="preserve">expected role </w:t>
-      </w:r>
-    </w:p>
-    <w:p>
-      <w:pPr>
-        <w:rPr>
-          <w:b/>
-          <w:bCs/>
-          <w:lang w:val="en-GB"/>
-        </w:rPr>
-      </w:pPr>
-      <w:r>
-        <w:rPr>
-          <w:b/>
-          <w:bCs/>
-          <w:lang w:val="en-GB"/>
-        </w:rPr>
+      <w:proofErr w:type="spellStart"/>
+      <w:proofErr w:type="gramStart"/>
+      <w:r>
+        <w:t>expected</w:t>
+      </w:r>
+      <w:proofErr w:type="spellEnd"/>
+      <w:proofErr w:type="gramEnd"/>
+      <w:r>
+        <w:t xml:space="preserve"> </w:t>
+      </w:r>
+      <w:proofErr w:type="spellStart"/>
+      <w:r>
+        <w:t>role</w:t>
+      </w:r>
+      <w:proofErr w:type="spellEnd"/>
+      <w:r>
+        <w:t xml:space="preserve"> </w:t>
+      </w:r>
+    </w:p>
+    <w:p>
+      <w:pPr>
+        <w:rPr>
+          <w:b/>
+          <w:bCs/>
+          <w:lang w:val="en-GB"/>
+        </w:rPr>
+      </w:pPr>
+      <w:r>
+        <w:rPr>
+          <w:b/>
+          <w:bCs/>
+          <w:lang w:val="en-GB"/>
+        </w:rPr>
+        <w:lastRenderedPageBreak/>
         <w:t>STEP 2 — Acquire and preserve RAW data</w:t>
       </w:r>
     </w:p>
     <w:p>
-      <w:r>
+      <w:pPr>
+        <w:rPr>
+          <w:lang w:val="en-GB"/>
+        </w:rPr>
+      </w:pPr>
+      <w:r>
+        <w:rPr>
+          <w:lang w:val="en-GB"/>
+        </w:rPr>
         <w:t>Never overwrite the originals.</w:t>
       </w:r>
     </w:p>
@@ -411,342 +530,3005 @@
           <w:bCs/>
           <w:lang w:val="en-GB"/>
         </w:rPr>
+        <w:t>STEP 3 — Clean each dataset independently</w:t>
+      </w:r>
+    </w:p>
+    <w:p>
+      <w:pPr>
+        <w:rPr>
+          <w:lang w:val="en-GB"/>
+        </w:rPr>
+      </w:pPr>
+      <w:r>
+        <w:rPr>
+          <w:lang w:val="en-GB"/>
+        </w:rPr>
+        <w:t>No conclusions.</w:t>
+      </w:r>
+    </w:p>
+    <w:p>
+      <w:pPr>
+        <w:rPr>
+          <w:b/>
+          <w:bCs/>
+          <w:lang w:val="en-GB"/>
+        </w:rPr>
+      </w:pPr>
+      <w:r>
+        <w:rPr>
+          <w:b/>
+          <w:bCs/>
+          <w:lang w:val="en-GB"/>
+        </w:rPr>
+        <w:t>STEP 4 — Create the data model</w:t>
+      </w:r>
+    </w:p>
+    <w:p>
+      <w:pPr>
+        <w:rPr>
+          <w:lang w:val="en-GB"/>
+        </w:rPr>
+      </w:pPr>
+      <w:r>
+        <w:rPr>
+          <w:lang w:val="en-GB"/>
+        </w:rPr>
+        <w:t>Determine:</w:t>
+      </w:r>
+    </w:p>
+    <w:p>
+      <w:pPr>
+        <w:rPr>
+          <w:lang w:val="en-GB"/>
+        </w:rPr>
+      </w:pPr>
+      <w:r>
+        <w:rPr>
+          <w:lang w:val="en-GB"/>
+        </w:rPr>
+        <w:t>PK / FK</w:t>
+      </w:r>
+    </w:p>
+    <w:p>
+      <w:pPr>
+        <w:rPr>
+          <w:lang w:val="en-GB"/>
+        </w:rPr>
+      </w:pPr>
+      <w:r>
+        <w:rPr>
+          <w:lang w:val="en-GB"/>
+        </w:rPr>
+        <w:t>geographic keys</w:t>
+      </w:r>
+    </w:p>
+    <w:p>
+      <w:pPr>
+        <w:rPr>
+          <w:lang w:val="en-GB"/>
+        </w:rPr>
+      </w:pPr>
+      <w:r>
+        <w:rPr>
+          <w:lang w:val="en-GB"/>
+        </w:rPr>
+        <w:t>temporal keys</w:t>
+      </w:r>
+    </w:p>
+    <w:p>
+      <w:pPr>
+        <w:rPr>
+          <w:lang w:val="en-GB"/>
+        </w:rPr>
+      </w:pPr>
+      <w:r>
+        <w:rPr>
+          <w:lang w:val="en-GB"/>
+        </w:rPr>
+        <w:t>operator keys</w:t>
+      </w:r>
+    </w:p>
+    <w:p>
+      <w:pPr>
+        <w:rPr>
+          <w:lang w:val="en-GB"/>
+        </w:rPr>
+      </w:pPr>
+      <w:r>
+        <w:rPr>
+          <w:lang w:val="en-GB"/>
+        </w:rPr>
+        <w:t>technology keys</w:t>
+      </w:r>
+    </w:p>
+    <w:p>
+      <w:pPr>
+        <w:rPr>
+          <w:b/>
+          <w:bCs/>
+          <w:lang w:val="en-GB"/>
+        </w:rPr>
+      </w:pPr>
+      <w:r>
+        <w:rPr>
+          <w:b/>
+          <w:bCs/>
+          <w:lang w:val="en-GB"/>
+        </w:rPr>
+        <w:t>STEP 5 — Store in MySQL</w:t>
+      </w:r>
+    </w:p>
+    <w:p>
+      <w:pPr>
+        <w:rPr>
+          <w:lang w:val="en-GB"/>
+        </w:rPr>
+      </w:pPr>
+      <w:r>
+        <w:rPr>
+          <w:lang w:val="en-GB"/>
+        </w:rPr>
+        <w:t>Relational model.</w:t>
+      </w:r>
+    </w:p>
+    <w:p>
+      <w:pPr>
+        <w:rPr>
+          <w:b/>
+          <w:bCs/>
+          <w:lang w:val="en-GB"/>
+        </w:rPr>
+      </w:pPr>
+      <w:r>
+        <w:rPr>
+          <w:b/>
+          <w:bCs/>
+          <w:lang w:val="en-GB"/>
+        </w:rPr>
+        <w:t xml:space="preserve">STEP 6 — Prepare </w:t>
+      </w:r>
+      <w:proofErr w:type="spellStart"/>
+      <w:r>
+        <w:rPr>
+          <w:b/>
+          <w:bCs/>
+          <w:lang w:val="en-GB"/>
+        </w:rPr>
+        <w:t>BigQuery</w:t>
+      </w:r>
+      <w:proofErr w:type="spellEnd"/>
+    </w:p>
+    <w:p>
+      <w:pPr>
+        <w:rPr>
+          <w:lang w:val="en-GB"/>
+        </w:rPr>
+      </w:pPr>
+      <w:r>
+        <w:rPr>
+          <w:lang w:val="en-GB"/>
+        </w:rPr>
+        <w:t>Denormalized analytical table.</w:t>
+      </w:r>
+    </w:p>
+    <w:p>
+      <w:pPr>
+        <w:rPr>
+          <w:b/>
+          <w:bCs/>
+          <w:lang w:val="en-GB"/>
+        </w:rPr>
+      </w:pPr>
+      <w:r>
+        <w:rPr>
+          <w:b/>
+          <w:bCs/>
+          <w:lang w:val="en-GB"/>
+        </w:rPr>
+        <w:t>STEP 7 — Build the integrated analytical dataset</w:t>
+      </w:r>
+    </w:p>
+    <w:p>
+      <w:pPr>
+        <w:rPr>
+          <w:lang w:val="en-GB"/>
+        </w:rPr>
+      </w:pPr>
+      <w:r>
+        <w:rPr>
+          <w:lang w:val="en-GB"/>
+        </w:rPr>
+        <w:t>Only now combine the sources.</w:t>
+      </w:r>
+    </w:p>
+    <w:p>
+      <w:pPr>
+        <w:rPr>
+          <w:b/>
+          <w:bCs/>
+          <w:lang w:val="en-GB"/>
+        </w:rPr>
+      </w:pPr>
+      <w:r>
+        <w:rPr>
+          <w:b/>
+          <w:bCs/>
+          <w:lang w:val="en-GB"/>
+        </w:rPr>
+        <w:t>STEP 8 — EDA</w:t>
+      </w:r>
+    </w:p>
+    <w:p>
+      <w:pPr>
+        <w:rPr>
+          <w:lang w:val="en-GB"/>
+        </w:rPr>
+      </w:pPr>
+      <w:r>
+        <w:rPr>
+          <w:lang w:val="en-GB"/>
+        </w:rPr>
+        <w:t>Start answering the business question.</w:t>
+      </w:r>
+    </w:p>
+    <w:p>
+      <w:pPr>
+        <w:rPr>
+          <w:b/>
+          <w:bCs/>
+          <w:lang w:val="en-GB"/>
+        </w:rPr>
+      </w:pPr>
+      <w:r>
+        <w:rPr>
+          <w:b/>
+          <w:bCs/>
+          <w:lang w:val="en-GB"/>
+        </w:rPr>
+        <w:t>STEP 9 — Hypothesis testing</w:t>
+      </w:r>
+    </w:p>
+    <w:p>
+      <w:pPr>
+        <w:rPr>
+          <w:lang w:val="en-GB"/>
+        </w:rPr>
+      </w:pPr>
+      <w:r>
+        <w:rPr>
+          <w:lang w:val="en-GB"/>
+        </w:rPr>
+        <w:t>Establish whether observed differences are statistically significant.</w:t>
+      </w:r>
+    </w:p>
+    <w:p>
+      <w:pPr>
+        <w:rPr>
+          <w:b/>
+          <w:bCs/>
+          <w:lang w:val="en-GB"/>
+        </w:rPr>
+      </w:pPr>
+      <w:r>
+        <w:rPr>
+          <w:b/>
+          <w:bCs/>
+          <w:lang w:val="en-GB"/>
+        </w:rPr>
+        <w:t>STEP 10 — Explain the disparities</w:t>
+      </w:r>
+    </w:p>
+    <w:p>
+      <w:pPr>
+        <w:rPr>
+          <w:lang w:val="en-GB"/>
+        </w:rPr>
+      </w:pPr>
+      <w:r>
+        <w:rPr>
+          <w:lang w:val="en-GB"/>
+        </w:rPr>
+        <w:t>Sites + Coverage + INSEE + radio conditions.</w:t>
+      </w:r>
+    </w:p>
+    <w:p>
+      <w:pPr>
+        <w:rPr>
+          <w:b/>
+          <w:bCs/>
+          <w:lang w:val="en-GB"/>
+        </w:rPr>
+      </w:pPr>
+      <w:r>
+        <w:rPr>
+          <w:b/>
+          <w:bCs/>
+          <w:lang w:val="en-GB"/>
+        </w:rPr>
+        <w:t>STEP 11 — Dashboard</w:t>
+      </w:r>
+    </w:p>
+    <w:p>
+      <w:pPr>
+        <w:rPr>
+          <w:lang w:val="en-GB"/>
+        </w:rPr>
+      </w:pPr>
+      <w:r>
+        <w:rPr>
+          <w:lang w:val="en-GB"/>
+        </w:rPr>
+        <w:t>Tell the story visually.</w:t>
+      </w:r>
+    </w:p>
+    <w:p>
+      <w:pPr>
+        <w:rPr>
+          <w:b/>
+          <w:bCs/>
+        </w:rPr>
+      </w:pPr>
+      <w:r>
+        <w:rPr>
+          <w:b/>
+          <w:bCs/>
+        </w:rPr>
+        <w:t xml:space="preserve">STEP 12 — </w:t>
+      </w:r>
+      <w:proofErr w:type="spellStart"/>
+      <w:r>
+        <w:rPr>
+          <w:b/>
+          <w:bCs/>
+        </w:rPr>
+        <w:t>Optional</w:t>
+      </w:r>
+      <w:proofErr w:type="spellEnd"/>
+      <w:r>
+        <w:rPr>
+          <w:b/>
+          <w:bCs/>
+        </w:rPr>
+        <w:t xml:space="preserve"> ML</w:t>
+      </w:r>
+    </w:p>
+    <w:p>
+      <w:pPr>
+        <w:rPr>
+          <w:b/>
+          <w:bCs/>
+        </w:rPr>
+      </w:pPr>
+    </w:p>
+    <w:p>
+      <w:pPr>
+        <w:rPr>
+          <w:b/>
+          <w:bCs/>
+        </w:rPr>
+      </w:pPr>
+      <w:r>
+        <w:rPr>
+          <w:b/>
+          <w:bCs/>
+          <w:highlight w:val="red"/>
+        </w:rPr>
+        <w:t>UPDATED PLAN</w:t>
+      </w:r>
+    </w:p>
+    <w:p>
+      <w:pPr>
+        <w:rPr>
+          <w:b/>
+          <w:bCs/>
+          <w:lang w:val="en-GB"/>
+        </w:rPr>
+      </w:pPr>
+      <w:r>
+        <w:rPr>
+          <w:b/>
+          <w:bCs/>
+          <w:lang w:val="en-GB"/>
+        </w:rPr>
         <w:lastRenderedPageBreak/>
-        <w:t>STEP 3 — Clean each dataset independently</w:t>
-      </w:r>
-    </w:p>
-    <w:p>
-      <w:pPr>
-        <w:rPr>
-          <w:lang w:val="en-GB"/>
-        </w:rPr>
-      </w:pPr>
-      <w:r>
-        <w:rPr>
-          <w:lang w:val="en-GB"/>
-        </w:rPr>
-        <w:t>No conclusions.</w:t>
-      </w:r>
-    </w:p>
-    <w:p>
-      <w:pPr>
-        <w:rPr>
-          <w:b/>
-          <w:bCs/>
-          <w:lang w:val="en-GB"/>
-        </w:rPr>
-      </w:pPr>
-      <w:r>
-        <w:rPr>
-          <w:b/>
-          <w:bCs/>
-          <w:lang w:val="en-GB"/>
-        </w:rPr>
-        <w:t>STEP 4 — Create the data model</w:t>
-      </w:r>
-    </w:p>
-    <w:p>
-      <w:pPr>
-        <w:rPr>
-          <w:lang w:val="en-GB"/>
-        </w:rPr>
-      </w:pPr>
-      <w:r>
-        <w:rPr>
-          <w:lang w:val="en-GB"/>
-        </w:rPr>
-        <w:t>Determine:</w:t>
-      </w:r>
-    </w:p>
-    <w:p>
-      <w:pPr>
-        <w:rPr>
-          <w:lang w:val="en-GB"/>
-        </w:rPr>
-      </w:pPr>
-      <w:r>
-        <w:rPr>
-          <w:lang w:val="en-GB"/>
-        </w:rPr>
-        <w:t>PK / FK</w:t>
-      </w:r>
-    </w:p>
-    <w:p>
-      <w:pPr>
-        <w:rPr>
-          <w:lang w:val="en-GB"/>
-        </w:rPr>
-      </w:pPr>
-      <w:r>
-        <w:rPr>
-          <w:lang w:val="en-GB"/>
-        </w:rPr>
-        <w:t>geographic keys</w:t>
-      </w:r>
-    </w:p>
-    <w:p>
-      <w:pPr>
-        <w:rPr>
-          <w:lang w:val="en-GB"/>
-        </w:rPr>
-      </w:pPr>
-      <w:r>
-        <w:rPr>
-          <w:lang w:val="en-GB"/>
-        </w:rPr>
-        <w:t>temporal keys</w:t>
-      </w:r>
-    </w:p>
-    <w:p>
-      <w:pPr>
-        <w:rPr>
-          <w:lang w:val="en-GB"/>
-        </w:rPr>
-      </w:pPr>
-      <w:r>
-        <w:rPr>
-          <w:lang w:val="en-GB"/>
-        </w:rPr>
-        <w:t>operator keys</w:t>
-      </w:r>
-    </w:p>
-    <w:p>
-      <w:pPr>
-        <w:rPr>
-          <w:lang w:val="en-GB"/>
-        </w:rPr>
-      </w:pPr>
-      <w:r>
-        <w:rPr>
-          <w:lang w:val="en-GB"/>
-        </w:rPr>
-        <w:t>technology keys</w:t>
-      </w:r>
-    </w:p>
-    <w:p>
-      <w:pPr>
-        <w:rPr>
-          <w:b/>
-          <w:bCs/>
-          <w:lang w:val="en-GB"/>
-        </w:rPr>
-      </w:pPr>
-      <w:r>
-        <w:rPr>
-          <w:b/>
-          <w:bCs/>
-          <w:lang w:val="en-GB"/>
-        </w:rPr>
-        <w:t>STEP 5 — Store in MySQL</w:t>
-      </w:r>
-    </w:p>
-    <w:p>
-      <w:pPr>
-        <w:rPr>
-          <w:lang w:val="en-GB"/>
-        </w:rPr>
-      </w:pPr>
-      <w:r>
-        <w:rPr>
-          <w:lang w:val="en-GB"/>
-        </w:rPr>
-        <w:t>Relational model.</w:t>
-      </w:r>
-    </w:p>
-    <w:p>
-      <w:pPr>
-        <w:rPr>
-          <w:b/>
-          <w:bCs/>
-          <w:lang w:val="en-GB"/>
-        </w:rPr>
-      </w:pPr>
-      <w:r>
-        <w:rPr>
-          <w:b/>
-          <w:bCs/>
-          <w:lang w:val="en-GB"/>
-        </w:rPr>
-        <w:t>STEP 6 — Prepare BigQuery</w:t>
-      </w:r>
-    </w:p>
-    <w:p>
-      <w:pPr>
-        <w:rPr>
-          <w:lang w:val="en-GB"/>
-        </w:rPr>
-      </w:pPr>
-      <w:r>
-        <w:rPr>
-          <w:lang w:val="en-GB"/>
-        </w:rPr>
-        <w:t>Denormalized analytical table.</w:t>
-      </w:r>
-    </w:p>
-    <w:p>
-      <w:pPr>
-        <w:rPr>
-          <w:b/>
-          <w:bCs/>
-          <w:lang w:val="en-GB"/>
-        </w:rPr>
-      </w:pPr>
-      <w:r>
-        <w:rPr>
-          <w:b/>
-          <w:bCs/>
-          <w:lang w:val="en-GB"/>
-        </w:rPr>
-        <w:t>STEP 7 — Build the integrated analytical dataset</w:t>
-      </w:r>
-    </w:p>
-    <w:p>
-      <w:pPr>
-        <w:rPr>
-          <w:lang w:val="en-GB"/>
-        </w:rPr>
-      </w:pPr>
-      <w:r>
-        <w:rPr>
-          <w:lang w:val="en-GB"/>
-        </w:rPr>
-        <w:t>Only now combine the sources.</w:t>
-      </w:r>
-    </w:p>
-    <w:p>
-      <w:pPr>
-        <w:rPr>
-          <w:b/>
-          <w:bCs/>
-          <w:lang w:val="en-GB"/>
-        </w:rPr>
-      </w:pPr>
-      <w:r>
-        <w:rPr>
-          <w:b/>
-          <w:bCs/>
-          <w:lang w:val="en-GB"/>
-        </w:rPr>
-        <w:t>STEP 8 — EDA</w:t>
-      </w:r>
-    </w:p>
-    <w:p>
-      <w:pPr>
-        <w:rPr>
-          <w:lang w:val="en-GB"/>
-        </w:rPr>
-      </w:pPr>
-      <w:r>
-        <w:rPr>
-          <w:lang w:val="en-GB"/>
-        </w:rPr>
-        <w:t>Start answering the business question.</w:t>
-      </w:r>
-    </w:p>
-    <w:p>
-      <w:pPr>
-        <w:rPr>
-          <w:b/>
-          <w:bCs/>
-          <w:lang w:val="en-GB"/>
-        </w:rPr>
-      </w:pPr>
-      <w:r>
-        <w:rPr>
-          <w:b/>
-          <w:bCs/>
-          <w:lang w:val="en-GB"/>
-        </w:rPr>
-        <w:t>STEP 9 — Hypothesis testing</w:t>
-      </w:r>
-    </w:p>
-    <w:p>
-      <w:pPr>
-        <w:rPr>
-          <w:lang w:val="en-GB"/>
-        </w:rPr>
-      </w:pPr>
-      <w:r>
-        <w:rPr>
-          <w:lang w:val="en-GB"/>
-        </w:rPr>
-        <w:t>Establish whether observed differences are statistically significant.</w:t>
-      </w:r>
-    </w:p>
-    <w:p>
-      <w:pPr>
-        <w:rPr>
-          <w:b/>
-          <w:bCs/>
-          <w:lang w:val="en-GB"/>
-        </w:rPr>
-      </w:pPr>
-      <w:r>
-        <w:rPr>
-          <w:b/>
-          <w:bCs/>
-          <w:lang w:val="en-GB"/>
-        </w:rPr>
-        <w:t>STEP 10 — Explain the disparities</w:t>
-      </w:r>
-    </w:p>
-    <w:p>
-      <w:pPr>
-        <w:rPr>
-          <w:lang w:val="en-GB"/>
-        </w:rPr>
-      </w:pPr>
-      <w:r>
-        <w:rPr>
-          <w:lang w:val="en-GB"/>
-        </w:rPr>
-        <w:t>Sites + Coverage + INSEE + radio conditions.</w:t>
-      </w:r>
-    </w:p>
-    <w:p>
-      <w:pPr>
-        <w:rPr>
-          <w:b/>
-          <w:bCs/>
-          <w:lang w:val="en-GB"/>
-        </w:rPr>
-      </w:pPr>
-      <w:r>
-        <w:rPr>
-          <w:b/>
-          <w:bCs/>
-          <w:lang w:val="en-GB"/>
-        </w:rPr>
-        <w:t>STEP 11 — Dashboard</w:t>
-      </w:r>
-    </w:p>
-    <w:p>
-      <w:pPr>
-        <w:rPr>
-          <w:lang w:val="en-GB"/>
-        </w:rPr>
-      </w:pPr>
-      <w:r>
-        <w:rPr>
-          <w:lang w:val="en-GB"/>
-        </w:rPr>
-        <w:t>Tell the story visually.</w:t>
-      </w:r>
-    </w:p>
-    <w:p>
-      <w:pPr>
-        <w:rPr>
-          <w:b/>
-          <w:bCs/>
-        </w:rPr>
-      </w:pPr>
-      <w:r>
-        <w:rPr>
-          <w:b/>
-          <w:bCs/>
-        </w:rPr>
-        <w:t>STEP 12 — Optional ML</w:t>
-      </w:r>
+        <w:t>Our data architecture is now cleaner:</w:t>
+      </w:r>
+    </w:p>
+    <w:tbl>
+      <w:tblPr>
+        <w:tblW w:w="0" w:type="auto"/>
+        <w:tblCellSpacing w:w="15" w:type="dxa"/>
+        <w:tblCellMar>
+          <w:top w:w="15" w:type="dxa"/>
+          <w:left w:w="15" w:type="dxa"/>
+          <w:bottom w:w="15" w:type="dxa"/>
+          <w:right w:w="15" w:type="dxa"/>
+        </w:tblCellMar>
+        <w:tblLook w:val="04A0" w:firstRow="1" w:lastRow="0" w:firstColumn="1" w:lastColumn="0" w:noHBand="0" w:noVBand="1"/>
+      </w:tblPr>
+      <w:tblGrid>
+        <w:gridCol w:w="1402"/>
+        <w:gridCol w:w="2190"/>
+        <w:gridCol w:w="5480"/>
+      </w:tblGrid>
+      <w:tr>
+        <w:trPr>
+          <w:tblHeader/>
+          <w:tblCellSpacing w:w="15" w:type="dxa"/>
+        </w:trPr>
+        <w:tc>
+          <w:tcPr>
+            <w:tcW w:w="0" w:type="auto"/>
+            <w:vAlign w:val="center"/>
+            <w:hideMark/>
+          </w:tcPr>
+          <w:p>
+            <w:pPr>
+              <w:rPr>
+                <w:b/>
+                <w:bCs/>
+              </w:rPr>
+            </w:pPr>
+            <w:r>
+              <w:rPr>
+                <w:b/>
+                <w:bCs/>
+              </w:rPr>
+              <w:t>Source</w:t>
+            </w:r>
+          </w:p>
+        </w:tc>
+        <w:tc>
+          <w:tcPr>
+            <w:tcW w:w="0" w:type="auto"/>
+            <w:vAlign w:val="center"/>
+            <w:hideMark/>
+          </w:tcPr>
+          <w:p>
+            <w:pPr>
+              <w:rPr>
+                <w:b/>
+                <w:bCs/>
+              </w:rPr>
+            </w:pPr>
+            <w:r>
+              <w:rPr>
+                <w:b/>
+                <w:bCs/>
+              </w:rPr>
+              <w:t xml:space="preserve">Acquisition </w:t>
+            </w:r>
+            <w:proofErr w:type="spellStart"/>
+            <w:r>
+              <w:rPr>
+                <w:b/>
+                <w:bCs/>
+              </w:rPr>
+              <w:t>method</w:t>
+            </w:r>
+            <w:proofErr w:type="spellEnd"/>
+          </w:p>
+        </w:tc>
+        <w:tc>
+          <w:tcPr>
+            <w:tcW w:w="0" w:type="auto"/>
+            <w:vAlign w:val="center"/>
+            <w:hideMark/>
+          </w:tcPr>
+          <w:p>
+            <w:pPr>
+              <w:rPr>
+                <w:b/>
+                <w:bCs/>
+              </w:rPr>
+            </w:pPr>
+            <w:proofErr w:type="spellStart"/>
+            <w:r>
+              <w:rPr>
+                <w:b/>
+                <w:bCs/>
+              </w:rPr>
+              <w:t>Role</w:t>
+            </w:r>
+            <w:proofErr w:type="spellEnd"/>
+            <w:r>
+              <w:rPr>
+                <w:b/>
+                <w:bCs/>
+              </w:rPr>
+              <w:t xml:space="preserve"> in the </w:t>
+            </w:r>
+            <w:proofErr w:type="spellStart"/>
+            <w:r>
+              <w:rPr>
+                <w:b/>
+                <w:bCs/>
+              </w:rPr>
+              <w:t>project</w:t>
+            </w:r>
+            <w:proofErr w:type="spellEnd"/>
+          </w:p>
+        </w:tc>
+      </w:tr>
+      <w:tr>
+        <w:trPr>
+          <w:tblCellSpacing w:w="15" w:type="dxa"/>
+        </w:trPr>
+        <w:tc>
+          <w:tcPr>
+            <w:tcW w:w="0" w:type="auto"/>
+            <w:vAlign w:val="center"/>
+            <w:hideMark/>
+          </w:tcPr>
+          <w:p>
+            <w:pPr>
+              <w:rPr>
+                <w:b/>
+                <w:bCs/>
+              </w:rPr>
+            </w:pPr>
+            <w:r>
+              <w:rPr>
+                <w:b/>
+                <w:bCs/>
+              </w:rPr>
+              <w:t>ARCEP QoS</w:t>
+            </w:r>
+          </w:p>
+        </w:tc>
+        <w:tc>
+          <w:tcPr>
+            <w:tcW w:w="0" w:type="auto"/>
+            <w:vAlign w:val="center"/>
+            <w:hideMark/>
+          </w:tcPr>
+          <w:p>
+            <w:pPr>
+              <w:rPr>
+                <w:b/>
+                <w:bCs/>
+              </w:rPr>
+            </w:pPr>
+            <w:r>
+              <w:rPr>
+                <w:b/>
+                <w:bCs/>
+              </w:rPr>
+              <w:t xml:space="preserve">Web </w:t>
+            </w:r>
+            <w:proofErr w:type="spellStart"/>
+            <w:r>
+              <w:rPr>
+                <w:b/>
+                <w:bCs/>
+              </w:rPr>
+              <w:t>scraping</w:t>
+            </w:r>
+            <w:proofErr w:type="spellEnd"/>
+          </w:p>
+        </w:tc>
+        <w:tc>
+          <w:tcPr>
+            <w:tcW w:w="0" w:type="auto"/>
+            <w:vAlign w:val="center"/>
+            <w:hideMark/>
+          </w:tcPr>
+          <w:p>
+            <w:pPr>
+              <w:rPr>
+                <w:b/>
+                <w:bCs/>
+                <w:lang w:val="en-GB"/>
+              </w:rPr>
+            </w:pPr>
+            <w:r>
+              <w:rPr>
+                <w:rFonts w:ascii="Segoe UI Emoji" w:hAnsi="Segoe UI Emoji" w:cs="Segoe UI Emoji"/>
+                <w:b/>
+                <w:bCs/>
+              </w:rPr>
+              <w:t>⭐</w:t>
+            </w:r>
+            <w:r>
+              <w:rPr>
+                <w:b/>
+                <w:bCs/>
+                <w:lang w:val="en-GB"/>
+              </w:rPr>
+              <w:t xml:space="preserve"> Main performance dataset — 5G measurements</w:t>
+            </w:r>
+          </w:p>
+        </w:tc>
+      </w:tr>
+      <w:tr>
+        <w:trPr>
+          <w:tblCellSpacing w:w="15" w:type="dxa"/>
+        </w:trPr>
+        <w:tc>
+          <w:tcPr>
+            <w:tcW w:w="0" w:type="auto"/>
+            <w:vAlign w:val="center"/>
+            <w:hideMark/>
+          </w:tcPr>
+          <w:p>
+            <w:pPr>
+              <w:rPr>
+                <w:b/>
+                <w:bCs/>
+              </w:rPr>
+            </w:pPr>
+            <w:r>
+              <w:rPr>
+                <w:b/>
+                <w:bCs/>
+              </w:rPr>
+              <w:t>ARCEP Sites</w:t>
+            </w:r>
+          </w:p>
+        </w:tc>
+        <w:tc>
+          <w:tcPr>
+            <w:tcW w:w="0" w:type="auto"/>
+            <w:vAlign w:val="center"/>
+            <w:hideMark/>
+          </w:tcPr>
+          <w:p>
+            <w:pPr>
+              <w:rPr>
+                <w:b/>
+                <w:bCs/>
+              </w:rPr>
+            </w:pPr>
+            <w:r>
+              <w:rPr>
+                <w:b/>
+                <w:bCs/>
+              </w:rPr>
+              <w:t xml:space="preserve">Web </w:t>
+            </w:r>
+            <w:proofErr w:type="spellStart"/>
+            <w:r>
+              <w:rPr>
+                <w:b/>
+                <w:bCs/>
+              </w:rPr>
+              <w:t>scraping</w:t>
+            </w:r>
+            <w:proofErr w:type="spellEnd"/>
+          </w:p>
+        </w:tc>
+        <w:tc>
+          <w:tcPr>
+            <w:tcW w:w="0" w:type="auto"/>
+            <w:vAlign w:val="center"/>
+            <w:hideMark/>
+          </w:tcPr>
+          <w:p>
+            <w:pPr>
+              <w:rPr>
+                <w:b/>
+                <w:bCs/>
+              </w:rPr>
+            </w:pPr>
+            <w:r>
+              <w:rPr>
+                <w:rFonts w:ascii="Segoe UI Emoji" w:hAnsi="Segoe UI Emoji" w:cs="Segoe UI Emoji"/>
+                <w:b/>
+                <w:bCs/>
+              </w:rPr>
+              <w:t>⭐</w:t>
+            </w:r>
+            <w:r>
+              <w:rPr>
+                <w:b/>
+                <w:bCs/>
+              </w:rPr>
+              <w:t xml:space="preserve"> Infrastructure </w:t>
+            </w:r>
+            <w:proofErr w:type="spellStart"/>
+            <w:r>
+              <w:rPr>
+                <w:b/>
+                <w:bCs/>
+              </w:rPr>
+              <w:t>explanation</w:t>
+            </w:r>
+            <w:proofErr w:type="spellEnd"/>
+            <w:r>
+              <w:rPr>
+                <w:b/>
+                <w:bCs/>
+              </w:rPr>
+              <w:t xml:space="preserve"> — 5G sites</w:t>
+            </w:r>
+          </w:p>
+        </w:tc>
+      </w:tr>
+      <w:tr>
+        <w:trPr>
+          <w:tblCellSpacing w:w="15" w:type="dxa"/>
+        </w:trPr>
+        <w:tc>
+          <w:tcPr>
+            <w:tcW w:w="0" w:type="auto"/>
+            <w:vAlign w:val="center"/>
+            <w:hideMark/>
+          </w:tcPr>
+          <w:p>
+            <w:pPr>
+              <w:rPr>
+                <w:b/>
+                <w:bCs/>
+              </w:rPr>
+            </w:pPr>
+            <w:r>
+              <w:rPr>
+                <w:b/>
+                <w:bCs/>
+              </w:rPr>
+              <w:t>INSEE</w:t>
+            </w:r>
+          </w:p>
+        </w:tc>
+        <w:tc>
+          <w:tcPr>
+            <w:tcW w:w="0" w:type="auto"/>
+            <w:vAlign w:val="center"/>
+            <w:hideMark/>
+          </w:tcPr>
+          <w:p>
+            <w:pPr>
+              <w:rPr>
+                <w:b/>
+                <w:bCs/>
+              </w:rPr>
+            </w:pPr>
+            <w:r>
+              <w:rPr>
+                <w:b/>
+                <w:bCs/>
+              </w:rPr>
+              <w:t>API</w:t>
+            </w:r>
+          </w:p>
+        </w:tc>
+        <w:tc>
+          <w:tcPr>
+            <w:tcW w:w="0" w:type="auto"/>
+            <w:vAlign w:val="center"/>
+            <w:hideMark/>
+          </w:tcPr>
+          <w:p>
+            <w:pPr>
+              <w:rPr>
+                <w:b/>
+                <w:bCs/>
+              </w:rPr>
+            </w:pPr>
+            <w:r>
+              <w:rPr>
+                <w:rFonts w:ascii="Segoe UI Emoji" w:hAnsi="Segoe UI Emoji" w:cs="Segoe UI Emoji"/>
+                <w:b/>
+                <w:bCs/>
+              </w:rPr>
+              <w:t>⭐</w:t>
+            </w:r>
+            <w:r>
+              <w:rPr>
+                <w:b/>
+                <w:bCs/>
+              </w:rPr>
+              <w:t xml:space="preserve"> Territorial/</w:t>
+            </w:r>
+            <w:proofErr w:type="spellStart"/>
+            <w:r>
+              <w:rPr>
+                <w:b/>
+                <w:bCs/>
+              </w:rPr>
+              <w:t>demographic</w:t>
+            </w:r>
+            <w:proofErr w:type="spellEnd"/>
+            <w:r>
+              <w:rPr>
+                <w:b/>
+                <w:bCs/>
+              </w:rPr>
+              <w:t xml:space="preserve"> </w:t>
+            </w:r>
+            <w:proofErr w:type="spellStart"/>
+            <w:r>
+              <w:rPr>
+                <w:b/>
+                <w:bCs/>
+              </w:rPr>
+              <w:t>explanation</w:t>
+            </w:r>
+            <w:proofErr w:type="spellEnd"/>
+          </w:p>
+        </w:tc>
+      </w:tr>
+      <w:tr>
+        <w:trPr>
+          <w:tblCellSpacing w:w="15" w:type="dxa"/>
+        </w:trPr>
+        <w:tc>
+          <w:tcPr>
+            <w:tcW w:w="0" w:type="auto"/>
+            <w:vAlign w:val="center"/>
+            <w:hideMark/>
+          </w:tcPr>
+          <w:p>
+            <w:pPr>
+              <w:rPr>
+                <w:b/>
+                <w:bCs/>
+              </w:rPr>
+            </w:pPr>
+            <w:r>
+              <w:rPr>
+                <w:b/>
+                <w:bCs/>
+              </w:rPr>
+              <w:t>MySQL</w:t>
+            </w:r>
+          </w:p>
+        </w:tc>
+        <w:tc>
+          <w:tcPr>
+            <w:tcW w:w="0" w:type="auto"/>
+            <w:vAlign w:val="center"/>
+            <w:hideMark/>
+          </w:tcPr>
+          <w:p>
+            <w:pPr>
+              <w:rPr>
+                <w:b/>
+                <w:bCs/>
+              </w:rPr>
+            </w:pPr>
+            <w:proofErr w:type="spellStart"/>
+            <w:r>
+              <w:rPr>
+                <w:b/>
+                <w:bCs/>
+              </w:rPr>
+              <w:t>Relational</w:t>
+            </w:r>
+            <w:proofErr w:type="spellEnd"/>
+            <w:r>
+              <w:rPr>
+                <w:b/>
+                <w:bCs/>
+              </w:rPr>
+              <w:t xml:space="preserve"> </w:t>
+            </w:r>
+            <w:proofErr w:type="spellStart"/>
+            <w:r>
+              <w:rPr>
+                <w:b/>
+                <w:bCs/>
+              </w:rPr>
+              <w:t>database</w:t>
+            </w:r>
+            <w:proofErr w:type="spellEnd"/>
+          </w:p>
+        </w:tc>
+        <w:tc>
+          <w:tcPr>
+            <w:tcW w:w="0" w:type="auto"/>
+            <w:vAlign w:val="center"/>
+            <w:hideMark/>
+          </w:tcPr>
+          <w:p>
+            <w:pPr>
+              <w:rPr>
+                <w:b/>
+                <w:bCs/>
+              </w:rPr>
+            </w:pPr>
+            <w:proofErr w:type="spellStart"/>
+            <w:r>
+              <w:rPr>
+                <w:b/>
+                <w:bCs/>
+              </w:rPr>
+              <w:t>Integration</w:t>
+            </w:r>
+            <w:proofErr w:type="spellEnd"/>
+            <w:r>
+              <w:rPr>
+                <w:b/>
+                <w:bCs/>
+              </w:rPr>
+              <w:t xml:space="preserve">, </w:t>
+            </w:r>
+            <w:proofErr w:type="spellStart"/>
+            <w:r>
+              <w:rPr>
+                <w:b/>
+                <w:bCs/>
+              </w:rPr>
+              <w:t>storage</w:t>
+            </w:r>
+            <w:proofErr w:type="spellEnd"/>
+            <w:r>
+              <w:rPr>
+                <w:b/>
+                <w:bCs/>
+              </w:rPr>
+              <w:t xml:space="preserve"> and </w:t>
+            </w:r>
+            <w:proofErr w:type="spellStart"/>
+            <w:r>
+              <w:rPr>
+                <w:b/>
+                <w:bCs/>
+              </w:rPr>
+              <w:t>querying</w:t>
+            </w:r>
+            <w:proofErr w:type="spellEnd"/>
+          </w:p>
+        </w:tc>
+      </w:tr>
+      <w:tr>
+        <w:trPr>
+          <w:tblCellSpacing w:w="15" w:type="dxa"/>
+        </w:trPr>
+        <w:tc>
+          <w:tcPr>
+            <w:tcW w:w="0" w:type="auto"/>
+            <w:vAlign w:val="center"/>
+            <w:hideMark/>
+          </w:tcPr>
+          <w:p>
+            <w:pPr>
+              <w:rPr>
+                <w:b/>
+                <w:bCs/>
+              </w:rPr>
+            </w:pPr>
+            <w:proofErr w:type="spellStart"/>
+            <w:r>
+              <w:rPr>
+                <w:b/>
+                <w:bCs/>
+              </w:rPr>
+              <w:t>BigQuery</w:t>
+            </w:r>
+            <w:proofErr w:type="spellEnd"/>
+          </w:p>
+        </w:tc>
+        <w:tc>
+          <w:tcPr>
+            <w:tcW w:w="0" w:type="auto"/>
+            <w:vAlign w:val="center"/>
+            <w:hideMark/>
+          </w:tcPr>
+          <w:p>
+            <w:pPr>
+              <w:rPr>
+                <w:b/>
+                <w:bCs/>
+              </w:rPr>
+            </w:pPr>
+            <w:r>
+              <w:rPr>
+                <w:b/>
+                <w:bCs/>
+              </w:rPr>
+              <w:t>Big Data system</w:t>
+            </w:r>
+          </w:p>
+        </w:tc>
+        <w:tc>
+          <w:tcPr>
+            <w:tcW w:w="0" w:type="auto"/>
+            <w:vAlign w:val="center"/>
+            <w:hideMark/>
+          </w:tcPr>
+          <w:p>
+            <w:pPr>
+              <w:rPr>
+                <w:b/>
+                <w:bCs/>
+              </w:rPr>
+            </w:pPr>
+            <w:r>
+              <w:rPr>
+                <w:b/>
+                <w:bCs/>
+              </w:rPr>
+              <w:t>Large-</w:t>
+            </w:r>
+            <w:proofErr w:type="spellStart"/>
+            <w:r>
+              <w:rPr>
+                <w:b/>
+                <w:bCs/>
+              </w:rPr>
+              <w:t>scale</w:t>
+            </w:r>
+            <w:proofErr w:type="spellEnd"/>
+            <w:r>
+              <w:rPr>
+                <w:b/>
+                <w:bCs/>
+              </w:rPr>
+              <w:t xml:space="preserve"> </w:t>
+            </w:r>
+            <w:proofErr w:type="spellStart"/>
+            <w:r>
+              <w:rPr>
+                <w:b/>
+                <w:bCs/>
+              </w:rPr>
+              <w:t>analytical</w:t>
+            </w:r>
+            <w:proofErr w:type="spellEnd"/>
+            <w:r>
+              <w:rPr>
+                <w:b/>
+                <w:bCs/>
+              </w:rPr>
+              <w:t xml:space="preserve"> </w:t>
+            </w:r>
+            <w:proofErr w:type="spellStart"/>
+            <w:r>
+              <w:rPr>
+                <w:b/>
+                <w:bCs/>
+              </w:rPr>
+              <w:t>dataset</w:t>
+            </w:r>
+            <w:proofErr w:type="spellEnd"/>
+          </w:p>
+        </w:tc>
+      </w:tr>
+    </w:tbl>
+    <w:p>
+      <w:pPr>
+        <w:rPr>
+          <w:b/>
+          <w:bCs/>
+        </w:rPr>
+      </w:pPr>
+      <w:r>
+        <w:rPr>
+          <w:b/>
+          <w:bCs/>
+        </w:rPr>
+        <w:t xml:space="preserve">The story </w:t>
+      </w:r>
+      <w:proofErr w:type="spellStart"/>
+      <w:r>
+        <w:rPr>
+          <w:b/>
+          <w:bCs/>
+        </w:rPr>
+        <w:t>becomes</w:t>
+      </w:r>
+      <w:proofErr w:type="spellEnd"/>
+      <w:r>
+        <w:rPr>
+          <w:b/>
+          <w:bCs/>
+        </w:rPr>
+        <w:t xml:space="preserve"> </w:t>
+      </w:r>
+      <w:proofErr w:type="spellStart"/>
+      <w:r>
+        <w:rPr>
+          <w:b/>
+          <w:bCs/>
+        </w:rPr>
+        <w:t>much</w:t>
+      </w:r>
+      <w:proofErr w:type="spellEnd"/>
+      <w:r>
+        <w:rPr>
+          <w:b/>
+          <w:bCs/>
+        </w:rPr>
+        <w:t xml:space="preserve"> </w:t>
+      </w:r>
+      <w:proofErr w:type="spellStart"/>
+      <w:r>
+        <w:rPr>
+          <w:b/>
+          <w:bCs/>
+        </w:rPr>
+        <w:t>stronger</w:t>
+      </w:r>
+      <w:proofErr w:type="spellEnd"/>
+    </w:p>
+    <w:p>
+      <w:pPr>
+        <w:rPr>
+          <w:b/>
+          <w:bCs/>
+          <w:lang w:val="en-GB"/>
+        </w:rPr>
+      </w:pPr>
+      <w:r>
+        <w:rPr>
+          <w:b/>
+          <w:bCs/>
+          <w:lang w:val="en-GB"/>
+        </w:rPr>
+        <w:t>5G QoS → Where are the disparities? → What explains them?</w:t>
+      </w:r>
+    </w:p>
+    <w:p>
+      <w:pPr>
+        <w:rPr>
+          <w:b/>
+          <w:bCs/>
+          <w:lang w:val="en-GB"/>
+        </w:rPr>
+      </w:pPr>
+      <w:r>
+        <w:rPr>
+          <w:b/>
+          <w:bCs/>
+          <w:lang w:val="en-GB"/>
+        </w:rPr>
+        <w:t>We can investigate:</w:t>
+      </w:r>
+    </w:p>
+    <w:p>
+      <w:pPr>
+        <w:numPr>
+          <w:ilvl w:val="0"/>
+          <w:numId w:val="7"/>
+        </w:numPr>
+        <w:rPr>
+          <w:b/>
+          <w:bCs/>
+        </w:rPr>
+      </w:pPr>
+      <w:r>
+        <w:rPr>
+          <w:b/>
+          <w:bCs/>
+        </w:rPr>
+        <w:t xml:space="preserve">Territorial </w:t>
+      </w:r>
+      <w:proofErr w:type="spellStart"/>
+      <w:r>
+        <w:rPr>
+          <w:b/>
+          <w:bCs/>
+        </w:rPr>
+        <w:t>disparities</w:t>
+      </w:r>
+      <w:proofErr w:type="spellEnd"/>
+      <w:r>
+        <w:rPr>
+          <w:b/>
+          <w:bCs/>
+        </w:rPr>
+        <w:t xml:space="preserve"> </w:t>
+      </w:r>
+    </w:p>
+    <w:p>
+      <w:pPr>
+        <w:numPr>
+          <w:ilvl w:val="1"/>
+          <w:numId w:val="7"/>
+        </w:numPr>
+        <w:rPr>
+          <w:b/>
+          <w:bCs/>
+        </w:rPr>
+      </w:pPr>
+      <w:proofErr w:type="gramStart"/>
+      <w:r>
+        <w:rPr>
+          <w:b/>
+          <w:bCs/>
+        </w:rPr>
+        <w:t>rural</w:t>
+      </w:r>
+      <w:proofErr w:type="gramEnd"/>
+      <w:r>
+        <w:rPr>
+          <w:b/>
+          <w:bCs/>
+        </w:rPr>
+        <w:t xml:space="preserve"> vs dense vs </w:t>
+      </w:r>
+      <w:proofErr w:type="spellStart"/>
+      <w:r>
+        <w:rPr>
+          <w:b/>
+          <w:bCs/>
+        </w:rPr>
+        <w:t>intermediate</w:t>
+      </w:r>
+      <w:proofErr w:type="spellEnd"/>
+      <w:r>
+        <w:rPr>
+          <w:b/>
+          <w:bCs/>
+        </w:rPr>
+        <w:t xml:space="preserve"> vs </w:t>
+      </w:r>
+      <w:proofErr w:type="spellStart"/>
+      <w:r>
+        <w:rPr>
+          <w:b/>
+          <w:bCs/>
+        </w:rPr>
+        <w:t>tourist</w:t>
+      </w:r>
+      <w:proofErr w:type="spellEnd"/>
+      <w:r>
+        <w:rPr>
+          <w:b/>
+          <w:bCs/>
+        </w:rPr>
+        <w:t xml:space="preserve"> zones </w:t>
+      </w:r>
+    </w:p>
+    <w:p>
+      <w:pPr>
+        <w:numPr>
+          <w:ilvl w:val="1"/>
+          <w:numId w:val="7"/>
+        </w:numPr>
+        <w:rPr>
+          <w:b/>
+          <w:bCs/>
+        </w:rPr>
+      </w:pPr>
+      <w:proofErr w:type="spellStart"/>
+      <w:proofErr w:type="gramStart"/>
+      <w:r>
+        <w:rPr>
+          <w:b/>
+          <w:bCs/>
+        </w:rPr>
+        <w:t>departments</w:t>
+      </w:r>
+      <w:proofErr w:type="spellEnd"/>
+      <w:proofErr w:type="gramEnd"/>
+      <w:r>
+        <w:rPr>
+          <w:b/>
+          <w:bCs/>
+        </w:rPr>
+        <w:t xml:space="preserve"> / </w:t>
+      </w:r>
+      <w:proofErr w:type="spellStart"/>
+      <w:r>
+        <w:rPr>
+          <w:b/>
+          <w:bCs/>
+        </w:rPr>
+        <w:t>regions</w:t>
+      </w:r>
+      <w:proofErr w:type="spellEnd"/>
+      <w:r>
+        <w:rPr>
+          <w:b/>
+          <w:bCs/>
+        </w:rPr>
+        <w:t xml:space="preserve"> </w:t>
+      </w:r>
+    </w:p>
+    <w:p>
+      <w:pPr>
+        <w:numPr>
+          <w:ilvl w:val="0"/>
+          <w:numId w:val="7"/>
+        </w:numPr>
+        <w:rPr>
+          <w:b/>
+          <w:bCs/>
+        </w:rPr>
+      </w:pPr>
+      <w:proofErr w:type="spellStart"/>
+      <w:r>
+        <w:rPr>
+          <w:b/>
+          <w:bCs/>
+        </w:rPr>
+        <w:t>Operator</w:t>
+      </w:r>
+      <w:proofErr w:type="spellEnd"/>
+      <w:r>
+        <w:rPr>
+          <w:b/>
+          <w:bCs/>
+        </w:rPr>
+        <w:t xml:space="preserve"> </w:t>
+      </w:r>
+      <w:proofErr w:type="spellStart"/>
+      <w:r>
+        <w:rPr>
+          <w:b/>
+          <w:bCs/>
+        </w:rPr>
+        <w:t>disparities</w:t>
+      </w:r>
+      <w:proofErr w:type="spellEnd"/>
+      <w:r>
+        <w:rPr>
+          <w:b/>
+          <w:bCs/>
+        </w:rPr>
+        <w:t xml:space="preserve"> </w:t>
+      </w:r>
+    </w:p>
+    <w:p>
+      <w:pPr>
+        <w:numPr>
+          <w:ilvl w:val="1"/>
+          <w:numId w:val="7"/>
+        </w:numPr>
+        <w:rPr>
+          <w:b/>
+          <w:bCs/>
+        </w:rPr>
+      </w:pPr>
+      <w:r>
+        <w:rPr>
+          <w:b/>
+          <w:bCs/>
+        </w:rPr>
+        <w:t xml:space="preserve">Orange vs SFR vs Bouygues vs Free </w:t>
+      </w:r>
+    </w:p>
+    <w:p>
+      <w:pPr>
+        <w:numPr>
+          <w:ilvl w:val="0"/>
+          <w:numId w:val="7"/>
+        </w:numPr>
+        <w:rPr>
+          <w:b/>
+          <w:bCs/>
+        </w:rPr>
+      </w:pPr>
+      <w:r>
+        <w:rPr>
+          <w:b/>
+          <w:bCs/>
+        </w:rPr>
+        <w:t>Usage/</w:t>
+      </w:r>
+      <w:proofErr w:type="spellStart"/>
+      <w:r>
+        <w:rPr>
+          <w:b/>
+          <w:bCs/>
+        </w:rPr>
+        <w:t>context</w:t>
+      </w:r>
+      <w:proofErr w:type="spellEnd"/>
+      <w:r>
+        <w:rPr>
+          <w:b/>
+          <w:bCs/>
+        </w:rPr>
+        <w:t xml:space="preserve"> </w:t>
+      </w:r>
+    </w:p>
+    <w:p>
+      <w:pPr>
+        <w:numPr>
+          <w:ilvl w:val="1"/>
+          <w:numId w:val="7"/>
+        </w:numPr>
+        <w:rPr>
+          <w:b/>
+          <w:bCs/>
+          <w:lang w:val="en-GB"/>
+        </w:rPr>
+      </w:pPr>
+      <w:r>
+        <w:rPr>
+          <w:b/>
+          <w:bCs/>
+          <w:lang w:val="en-GB"/>
+        </w:rPr>
+        <w:t xml:space="preserve">outdoor vs indoor vs in-car </w:t>
+      </w:r>
+    </w:p>
+    <w:p>
+      <w:pPr>
+        <w:numPr>
+          <w:ilvl w:val="1"/>
+          <w:numId w:val="7"/>
+        </w:numPr>
+        <w:rPr>
+          <w:b/>
+          <w:bCs/>
+        </w:rPr>
+      </w:pPr>
+      <w:proofErr w:type="gramStart"/>
+      <w:r>
+        <w:rPr>
+          <w:b/>
+          <w:bCs/>
+        </w:rPr>
+        <w:t>time</w:t>
+      </w:r>
+      <w:proofErr w:type="gramEnd"/>
+      <w:r>
+        <w:rPr>
+          <w:b/>
+          <w:bCs/>
+        </w:rPr>
+        <w:t xml:space="preserve">/date if </w:t>
+      </w:r>
+      <w:proofErr w:type="spellStart"/>
+      <w:r>
+        <w:rPr>
+          <w:b/>
+          <w:bCs/>
+        </w:rPr>
+        <w:t>useful</w:t>
+      </w:r>
+      <w:proofErr w:type="spellEnd"/>
+      <w:r>
+        <w:rPr>
+          <w:b/>
+          <w:bCs/>
+        </w:rPr>
+        <w:t xml:space="preserve"> </w:t>
+      </w:r>
+    </w:p>
+    <w:p>
+      <w:pPr>
+        <w:numPr>
+          <w:ilvl w:val="0"/>
+          <w:numId w:val="7"/>
+        </w:numPr>
+        <w:rPr>
+          <w:b/>
+          <w:bCs/>
+        </w:rPr>
+      </w:pPr>
+      <w:r>
+        <w:rPr>
+          <w:b/>
+          <w:bCs/>
+        </w:rPr>
+        <w:t xml:space="preserve">Radio conditions </w:t>
+      </w:r>
+    </w:p>
+    <w:p>
+      <w:pPr>
+        <w:numPr>
+          <w:ilvl w:val="1"/>
+          <w:numId w:val="7"/>
+        </w:numPr>
+        <w:rPr>
+          <w:b/>
+          <w:bCs/>
+        </w:rPr>
+      </w:pPr>
+      <w:r>
+        <w:rPr>
+          <w:b/>
+          <w:bCs/>
+        </w:rPr>
+        <w:t xml:space="preserve">RSRP </w:t>
+      </w:r>
+    </w:p>
+    <w:p>
+      <w:pPr>
+        <w:numPr>
+          <w:ilvl w:val="1"/>
+          <w:numId w:val="7"/>
+        </w:numPr>
+        <w:rPr>
+          <w:b/>
+          <w:bCs/>
+        </w:rPr>
+      </w:pPr>
+      <w:r>
+        <w:rPr>
+          <w:b/>
+          <w:bCs/>
+        </w:rPr>
+        <w:t xml:space="preserve">RSRQ </w:t>
+      </w:r>
+    </w:p>
+    <w:p>
+      <w:pPr>
+        <w:numPr>
+          <w:ilvl w:val="0"/>
+          <w:numId w:val="7"/>
+        </w:numPr>
+        <w:rPr>
+          <w:b/>
+          <w:bCs/>
+        </w:rPr>
+      </w:pPr>
+      <w:r>
+        <w:rPr>
+          <w:b/>
+          <w:bCs/>
+        </w:rPr>
+        <w:t xml:space="preserve">Infrastructure </w:t>
+      </w:r>
+    </w:p>
+    <w:p>
+      <w:pPr>
+        <w:numPr>
+          <w:ilvl w:val="1"/>
+          <w:numId w:val="7"/>
+        </w:numPr>
+        <w:rPr>
+          <w:b/>
+          <w:bCs/>
+        </w:rPr>
+      </w:pPr>
+      <w:proofErr w:type="spellStart"/>
+      <w:proofErr w:type="gramStart"/>
+      <w:r>
+        <w:rPr>
+          <w:b/>
+          <w:bCs/>
+        </w:rPr>
+        <w:t>number</w:t>
+      </w:r>
+      <w:proofErr w:type="spellEnd"/>
+      <w:proofErr w:type="gramEnd"/>
+      <w:r>
+        <w:rPr>
+          <w:b/>
+          <w:bCs/>
+        </w:rPr>
+        <w:t>/</w:t>
+      </w:r>
+      <w:proofErr w:type="spellStart"/>
+      <w:r>
+        <w:rPr>
+          <w:b/>
+          <w:bCs/>
+        </w:rPr>
+        <w:t>density</w:t>
+      </w:r>
+      <w:proofErr w:type="spellEnd"/>
+      <w:r>
+        <w:rPr>
+          <w:b/>
+          <w:bCs/>
+        </w:rPr>
+        <w:t xml:space="preserve"> of 5G sites </w:t>
+      </w:r>
+    </w:p>
+    <w:p>
+      <w:pPr>
+        <w:numPr>
+          <w:ilvl w:val="1"/>
+          <w:numId w:val="7"/>
+        </w:numPr>
+        <w:rPr>
+          <w:b/>
+          <w:bCs/>
+        </w:rPr>
+      </w:pPr>
+      <w:proofErr w:type="spellStart"/>
+      <w:proofErr w:type="gramStart"/>
+      <w:r>
+        <w:rPr>
+          <w:b/>
+          <w:bCs/>
+        </w:rPr>
+        <w:t>operator</w:t>
+      </w:r>
+      <w:proofErr w:type="spellEnd"/>
+      <w:proofErr w:type="gramEnd"/>
+      <w:r>
+        <w:rPr>
+          <w:b/>
+          <w:bCs/>
+        </w:rPr>
+        <w:t xml:space="preserve"> </w:t>
+      </w:r>
+      <w:proofErr w:type="spellStart"/>
+      <w:r>
+        <w:rPr>
+          <w:b/>
+          <w:bCs/>
+        </w:rPr>
+        <w:t>presence</w:t>
+      </w:r>
+      <w:proofErr w:type="spellEnd"/>
+      <w:r>
+        <w:rPr>
+          <w:b/>
+          <w:bCs/>
+        </w:rPr>
+        <w:t xml:space="preserve"> </w:t>
+      </w:r>
+    </w:p>
+    <w:p>
+      <w:pPr>
+        <w:numPr>
+          <w:ilvl w:val="1"/>
+          <w:numId w:val="7"/>
+        </w:numPr>
+        <w:rPr>
+          <w:b/>
+          <w:bCs/>
+        </w:rPr>
+      </w:pPr>
+      <w:proofErr w:type="spellStart"/>
+      <w:proofErr w:type="gramStart"/>
+      <w:r>
+        <w:rPr>
+          <w:b/>
+          <w:bCs/>
+        </w:rPr>
+        <w:lastRenderedPageBreak/>
+        <w:t>potentially</w:t>
+      </w:r>
+      <w:proofErr w:type="spellEnd"/>
+      <w:proofErr w:type="gramEnd"/>
+      <w:r>
+        <w:rPr>
+          <w:b/>
+          <w:bCs/>
+        </w:rPr>
+        <w:t xml:space="preserve"> 5G </w:t>
+      </w:r>
+      <w:proofErr w:type="spellStart"/>
+      <w:r>
+        <w:rPr>
+          <w:b/>
+          <w:bCs/>
+        </w:rPr>
+        <w:t>frequency</w:t>
+      </w:r>
+      <w:proofErr w:type="spellEnd"/>
+      <w:r>
+        <w:rPr>
+          <w:b/>
+          <w:bCs/>
+        </w:rPr>
+        <w:t xml:space="preserve"> configuration </w:t>
+      </w:r>
+    </w:p>
+    <w:p>
+      <w:pPr>
+        <w:numPr>
+          <w:ilvl w:val="0"/>
+          <w:numId w:val="7"/>
+        </w:numPr>
+        <w:rPr>
+          <w:b/>
+          <w:bCs/>
+        </w:rPr>
+      </w:pPr>
+      <w:r>
+        <w:rPr>
+          <w:b/>
+          <w:bCs/>
+        </w:rPr>
+        <w:t xml:space="preserve">Territorial </w:t>
+      </w:r>
+      <w:proofErr w:type="spellStart"/>
+      <w:r>
+        <w:rPr>
+          <w:b/>
+          <w:bCs/>
+        </w:rPr>
+        <w:t>characteristics</w:t>
+      </w:r>
+      <w:proofErr w:type="spellEnd"/>
+      <w:r>
+        <w:rPr>
+          <w:b/>
+          <w:bCs/>
+        </w:rPr>
+        <w:t xml:space="preserve"> </w:t>
+      </w:r>
+    </w:p>
+    <w:p>
+      <w:pPr>
+        <w:numPr>
+          <w:ilvl w:val="1"/>
+          <w:numId w:val="7"/>
+        </w:numPr>
+        <w:rPr>
+          <w:b/>
+          <w:bCs/>
+        </w:rPr>
+      </w:pPr>
+      <w:proofErr w:type="gramStart"/>
+      <w:r>
+        <w:rPr>
+          <w:b/>
+          <w:bCs/>
+        </w:rPr>
+        <w:t>population</w:t>
+      </w:r>
+      <w:proofErr w:type="gramEnd"/>
+      <w:r>
+        <w:rPr>
+          <w:b/>
+          <w:bCs/>
+        </w:rPr>
+        <w:t xml:space="preserve"> </w:t>
+      </w:r>
+    </w:p>
+    <w:p>
+      <w:pPr>
+        <w:numPr>
+          <w:ilvl w:val="1"/>
+          <w:numId w:val="7"/>
+        </w:numPr>
+        <w:rPr>
+          <w:b/>
+          <w:bCs/>
+        </w:rPr>
+      </w:pPr>
+      <w:proofErr w:type="spellStart"/>
+      <w:proofErr w:type="gramStart"/>
+      <w:r>
+        <w:rPr>
+          <w:b/>
+          <w:bCs/>
+        </w:rPr>
+        <w:t>density</w:t>
+      </w:r>
+      <w:proofErr w:type="spellEnd"/>
+      <w:proofErr w:type="gramEnd"/>
+      <w:r>
+        <w:rPr>
+          <w:b/>
+          <w:bCs/>
+        </w:rPr>
+        <w:t xml:space="preserve"> </w:t>
+      </w:r>
+    </w:p>
+    <w:p>
+      <w:pPr>
+        <w:numPr>
+          <w:ilvl w:val="1"/>
+          <w:numId w:val="7"/>
+        </w:numPr>
+        <w:rPr>
+          <w:b/>
+          <w:bCs/>
+        </w:rPr>
+      </w:pPr>
+      <w:proofErr w:type="spellStart"/>
+      <w:proofErr w:type="gramStart"/>
+      <w:r>
+        <w:rPr>
+          <w:b/>
+          <w:bCs/>
+        </w:rPr>
+        <w:t>other</w:t>
+      </w:r>
+      <w:proofErr w:type="spellEnd"/>
+      <w:proofErr w:type="gramEnd"/>
+      <w:r>
+        <w:rPr>
+          <w:b/>
+          <w:bCs/>
+        </w:rPr>
+        <w:t xml:space="preserve"> relevant INSEE </w:t>
+      </w:r>
+      <w:proofErr w:type="spellStart"/>
+      <w:r>
+        <w:rPr>
+          <w:b/>
+          <w:bCs/>
+        </w:rPr>
+        <w:t>indicators</w:t>
+      </w:r>
+      <w:proofErr w:type="spellEnd"/>
+      <w:r>
+        <w:rPr>
+          <w:b/>
+          <w:bCs/>
+        </w:rPr>
+        <w:t xml:space="preserve"> </w:t>
+      </w:r>
+    </w:p>
+    <w:p>
+      <w:pPr>
+        <w:rPr>
+          <w:b/>
+          <w:bCs/>
+          <w:lang w:val="en-GB"/>
+        </w:rPr>
+      </w:pPr>
+      <w:r>
+        <w:rPr>
+          <w:b/>
+          <w:bCs/>
+          <w:lang w:val="en-GB"/>
+        </w:rPr>
+        <w:t>This gives us a much more coherent causal/explanatory direction:</w:t>
+      </w:r>
+    </w:p>
+    <w:p>
+      <w:pPr>
+        <w:rPr>
+          <w:b/>
+          <w:bCs/>
+          <w:lang w:val="en-GB"/>
+        </w:rPr>
+      </w:pPr>
+      <w:r>
+        <w:rPr>
+          <w:b/>
+          <w:bCs/>
+          <w:lang w:val="en-GB"/>
+        </w:rPr>
+        <w:t>Are territorial differences in 5G performance associated with differences in network infrastructure, radio conditions and territorial characteristics?</w:t>
+      </w:r>
+    </w:p>
+    <w:p>
+      <w:pPr>
+        <w:rPr>
+          <w:b/>
+          <w:bCs/>
+        </w:rPr>
+      </w:pPr>
+      <w:r>
+        <w:rPr>
+          <w:b/>
+          <w:bCs/>
+          <w:lang w:val="en-GB"/>
+        </w:rPr>
+        <w:t xml:space="preserve">And importantly, we are not trying to prove causality unless the data/design supports it. </w:t>
+      </w:r>
+      <w:proofErr w:type="spellStart"/>
+      <w:r>
+        <w:rPr>
+          <w:b/>
+          <w:bCs/>
+        </w:rPr>
+        <w:t>We'll</w:t>
+      </w:r>
+      <w:proofErr w:type="spellEnd"/>
+      <w:r>
+        <w:rPr>
+          <w:b/>
+          <w:bCs/>
+        </w:rPr>
+        <w:t xml:space="preserve"> talk about </w:t>
+      </w:r>
+      <w:r>
+        <w:rPr>
+          <w:b/>
+          <w:bCs/>
+          <w:i/>
+          <w:iCs/>
+        </w:rPr>
+        <w:t>associations</w:t>
+      </w:r>
+      <w:r>
+        <w:rPr>
+          <w:b/>
+          <w:bCs/>
+        </w:rPr>
+        <w:t xml:space="preserve"> and </w:t>
+      </w:r>
+      <w:proofErr w:type="spellStart"/>
+      <w:r>
+        <w:rPr>
+          <w:b/>
+          <w:bCs/>
+          <w:i/>
+          <w:iCs/>
+        </w:rPr>
+        <w:t>potential</w:t>
+      </w:r>
+      <w:proofErr w:type="spellEnd"/>
+      <w:r>
+        <w:rPr>
+          <w:b/>
+          <w:bCs/>
+          <w:i/>
+          <w:iCs/>
+        </w:rPr>
+        <w:t xml:space="preserve"> </w:t>
+      </w:r>
+      <w:proofErr w:type="spellStart"/>
+      <w:r>
+        <w:rPr>
+          <w:b/>
+          <w:bCs/>
+          <w:i/>
+          <w:iCs/>
+        </w:rPr>
+        <w:t>explanations</w:t>
+      </w:r>
+      <w:proofErr w:type="spellEnd"/>
+      <w:r>
+        <w:rPr>
+          <w:b/>
+          <w:bCs/>
+        </w:rPr>
+        <w:t>.</w:t>
+      </w:r>
+    </w:p>
+    <w:p>
+      <w:pPr>
+        <w:rPr>
+          <w:b/>
+          <w:bCs/>
+        </w:rPr>
+      </w:pPr>
+    </w:p>
+    <w:p>
+      <w:pPr>
+        <w:rPr>
+          <w:b/>
+          <w:bCs/>
+        </w:rPr>
+      </w:pPr>
+    </w:p>
+    <w:p>
+      <w:pPr>
+        <w:rPr>
+          <w:b/>
+          <w:bCs/>
+        </w:rPr>
+      </w:pPr>
+      <w:r>
+        <w:rPr>
+          <w:b/>
+          <w:bCs/>
+        </w:rPr>
+        <w:t xml:space="preserve">Last </w:t>
+      </w:r>
+      <w:proofErr w:type="spellStart"/>
+      <w:r>
+        <w:rPr>
+          <w:b/>
+          <w:bCs/>
+        </w:rPr>
+        <w:t>chatgpt</w:t>
+      </w:r>
+      <w:proofErr w:type="spellEnd"/>
+      <w:r>
+        <w:rPr>
+          <w:b/>
+          <w:bCs/>
+        </w:rPr>
+        <w:t> :</w:t>
+      </w:r>
+    </w:p>
+    <w:p>
+      <w:pPr>
+        <w:rPr>
+          <w:lang w:val="en-GB"/>
+        </w:rPr>
+      </w:pPr>
+      <w:r>
+        <w:rPr>
+          <w:lang w:val="en-GB"/>
+        </w:rPr>
+        <w:t xml:space="preserve">Excellent. </w:t>
+      </w:r>
+      <w:r>
+        <w:rPr>
+          <w:rFonts w:ascii="Segoe UI Emoji" w:hAnsi="Segoe UI Emoji" w:cs="Segoe UI Emoji"/>
+          <w:lang w:val="en-GB"/>
+        </w:rPr>
+        <w:t>✅</w:t>
+      </w:r>
+      <w:r>
+        <w:rPr>
+          <w:lang w:val="en-GB"/>
+        </w:rPr>
+        <w:t xml:space="preserve"> Dataset mobile_5g_network_fr is created.</w:t>
+      </w:r>
+    </w:p>
+    <w:p>
+      <w:pPr>
+        <w:rPr>
+          <w:lang w:val="en-GB"/>
+        </w:rPr>
+      </w:pPr>
+      <w:r>
+        <w:rPr>
+          <w:lang w:val="en-GB"/>
+        </w:rPr>
+        <w:t xml:space="preserve">STEP 6.2 — Design the denormalized </w:t>
+      </w:r>
+      <w:proofErr w:type="spellStart"/>
+      <w:r>
+        <w:rPr>
+          <w:lang w:val="en-GB"/>
+        </w:rPr>
+        <w:t>BigQuery</w:t>
+      </w:r>
+      <w:proofErr w:type="spellEnd"/>
+      <w:r>
+        <w:rPr>
+          <w:lang w:val="en-GB"/>
+        </w:rPr>
+        <w:t xml:space="preserve"> table</w:t>
+      </w:r>
+    </w:p>
+    <w:p>
+      <w:pPr>
+        <w:rPr>
+          <w:lang w:val="en-GB"/>
+        </w:rPr>
+      </w:pPr>
+      <w:r>
+        <w:rPr>
+          <w:lang w:val="en-GB"/>
+        </w:rPr>
+        <w:t>Before loading data, we need to decide what one BigQuery row represents.</w:t>
+      </w:r>
+    </w:p>
+    <w:p>
+      <w:pPr>
+        <w:rPr>
+          <w:lang w:val="en-GB"/>
+        </w:rPr>
+      </w:pPr>
+      <w:r>
+        <w:rPr>
+          <w:lang w:val="en-GB"/>
+        </w:rPr>
+        <w:t>We should not directly join FACT_QOS_MEASUREMENTS to SITES, because one commune/operator can contain many sites. That would duplicate each QoS measurement many times.</w:t>
+      </w:r>
+    </w:p>
+    <w:p>
+      <w:pPr>
+        <w:rPr>
+          <w:lang w:val="en-GB"/>
+        </w:rPr>
+      </w:pPr>
+      <w:r>
+        <w:rPr>
+          <w:lang w:val="en-GB"/>
+        </w:rPr>
+        <w:t>Instead, we'll first aggregate the sites by:</w:t>
+      </w:r>
+    </w:p>
+    <w:p>
+      <w:pPr>
+        <w:rPr>
+          <w:lang w:val="en-GB"/>
+        </w:rPr>
+      </w:pPr>
+      <w:r>
+        <w:rPr>
+          <w:lang w:val="en-GB"/>
+        </w:rPr>
+        <w:t>insee_com + operator_id</w:t>
+      </w:r>
+    </w:p>
+    <w:p>
+      <w:pPr>
+        <w:rPr>
+          <w:lang w:val="en-GB"/>
+        </w:rPr>
+      </w:pPr>
+      <w:r>
+        <w:rPr>
+          <w:lang w:val="en-GB"/>
+        </w:rPr>
+        <w:t>For example:</w:t>
+      </w:r>
+    </w:p>
+    <w:tbl>
+      <w:tblPr>
+        <w:tblW w:w="0" w:type="auto"/>
+        <w:tblCellSpacing w:w="15" w:type="dxa"/>
+        <w:tblCellMar>
+          <w:top w:w="15" w:type="dxa"/>
+          <w:left w:w="15" w:type="dxa"/>
+          <w:bottom w:w="15" w:type="dxa"/>
+          <w:right w:w="15" w:type="dxa"/>
+        </w:tblCellMar>
+        <w:tblLook w:val="04A0" w:firstRow="1" w:lastRow="0" w:firstColumn="1" w:lastColumn="0" w:noHBand="0" w:noVBand="1"/>
+      </w:tblPr>
+      <w:tblGrid>
+        <w:gridCol w:w="1207"/>
+        <w:gridCol w:w="942"/>
+        <w:gridCol w:w="1010"/>
+        <w:gridCol w:w="1365"/>
+        <w:gridCol w:w="1380"/>
+      </w:tblGrid>
+      <w:tr>
+        <w:trPr>
+          <w:tblHeader/>
+          <w:tblCellSpacing w:w="15" w:type="dxa"/>
+        </w:trPr>
+        <w:tc>
+          <w:tcPr>
+            <w:tcW w:w="0" w:type="auto"/>
+            <w:vAlign w:val="center"/>
+            <w:hideMark/>
+          </w:tcPr>
+          <w:p>
+            <w:proofErr w:type="spellStart"/>
+            <w:proofErr w:type="gramStart"/>
+            <w:r>
+              <w:t>insee</w:t>
+            </w:r>
+            <w:proofErr w:type="gramEnd"/>
+            <w:r>
+              <w:t>_com</w:t>
+            </w:r>
+            <w:proofErr w:type="spellEnd"/>
+          </w:p>
+        </w:tc>
+        <w:tc>
+          <w:tcPr>
+            <w:tcW w:w="0" w:type="auto"/>
+            <w:vAlign w:val="center"/>
+            <w:hideMark/>
+          </w:tcPr>
+          <w:p>
+            <w:proofErr w:type="spellStart"/>
+            <w:proofErr w:type="gramStart"/>
+            <w:r>
+              <w:t>operator</w:t>
+            </w:r>
+            <w:proofErr w:type="spellEnd"/>
+            <w:proofErr w:type="gramEnd"/>
+          </w:p>
+        </w:tc>
+        <w:tc>
+          <w:tcPr>
+            <w:tcW w:w="0" w:type="auto"/>
+            <w:vAlign w:val="center"/>
+            <w:hideMark/>
+          </w:tcPr>
+          <w:p>
+            <w:proofErr w:type="spellStart"/>
+            <w:proofErr w:type="gramStart"/>
+            <w:r>
+              <w:t>nbr</w:t>
+            </w:r>
+            <w:proofErr w:type="gramEnd"/>
+            <w:r>
+              <w:t>_sites</w:t>
+            </w:r>
+            <w:proofErr w:type="spellEnd"/>
+          </w:p>
+        </w:tc>
+        <w:tc>
+          <w:tcPr>
+            <w:tcW w:w="0" w:type="auto"/>
+            <w:vAlign w:val="center"/>
+            <w:hideMark/>
+          </w:tcPr>
+          <w:p>
+            <w:proofErr w:type="gramStart"/>
+            <w:r>
+              <w:t>nbr</w:t>
+            </w:r>
+            <w:proofErr w:type="gramEnd"/>
+            <w:r>
+              <w:t>_4g_sites</w:t>
+            </w:r>
+          </w:p>
+        </w:tc>
+        <w:tc>
+          <w:tcPr>
+            <w:tcW w:w="0" w:type="auto"/>
+            <w:vAlign w:val="center"/>
+            <w:hideMark/>
+          </w:tcPr>
+          <w:p>
+            <w:proofErr w:type="gramStart"/>
+            <w:r>
+              <w:t>nbr</w:t>
+            </w:r>
+            <w:proofErr w:type="gramEnd"/>
+            <w:r>
+              <w:t>_5g_sites</w:t>
+            </w:r>
+          </w:p>
+        </w:tc>
+      </w:tr>
+      <w:tr>
+        <w:trPr>
+          <w:tblCellSpacing w:w="15" w:type="dxa"/>
+        </w:trPr>
+        <w:tc>
+          <w:tcPr>
+            <w:tcW w:w="0" w:type="auto"/>
+            <w:vAlign w:val="center"/>
+            <w:hideMark/>
+          </w:tcPr>
+          <w:p>
+            <w:r>
+              <w:t>78123</w:t>
+            </w:r>
+          </w:p>
+        </w:tc>
+        <w:tc>
+          <w:tcPr>
+            <w:tcW w:w="0" w:type="auto"/>
+            <w:vAlign w:val="center"/>
+            <w:hideMark/>
+          </w:tcPr>
+          <w:p>
+            <w:r>
+              <w:t>Orange</w:t>
+            </w:r>
+          </w:p>
+        </w:tc>
+        <w:tc>
+          <w:tcPr>
+            <w:tcW w:w="0" w:type="auto"/>
+            <w:vAlign w:val="center"/>
+            <w:hideMark/>
+          </w:tcPr>
+          <w:p>
+            <w:r>
+              <w:t>12</w:t>
+            </w:r>
+          </w:p>
+        </w:tc>
+        <w:tc>
+          <w:tcPr>
+            <w:tcW w:w="0" w:type="auto"/>
+            <w:vAlign w:val="center"/>
+            <w:hideMark/>
+          </w:tcPr>
+          <w:p>
+            <w:r>
+              <w:t>10</w:t>
+            </w:r>
+          </w:p>
+        </w:tc>
+        <w:tc>
+          <w:tcPr>
+            <w:tcW w:w="0" w:type="auto"/>
+            <w:vAlign w:val="center"/>
+            <w:hideMark/>
+          </w:tcPr>
+          <w:p>
+            <w:r>
+              <w:t>8</w:t>
+            </w:r>
+          </w:p>
+        </w:tc>
+      </w:tr>
+      <w:tr>
+        <w:trPr>
+          <w:tblCellSpacing w:w="15" w:type="dxa"/>
+        </w:trPr>
+        <w:tc>
+          <w:tcPr>
+            <w:tcW w:w="0" w:type="auto"/>
+            <w:vAlign w:val="center"/>
+            <w:hideMark/>
+          </w:tcPr>
+          <w:p>
+            <w:r>
+              <w:t>78123</w:t>
+            </w:r>
+          </w:p>
+        </w:tc>
+        <w:tc>
+          <w:tcPr>
+            <w:tcW w:w="0" w:type="auto"/>
+            <w:vAlign w:val="center"/>
+            <w:hideMark/>
+          </w:tcPr>
+          <w:p>
+            <w:r>
+              <w:t>SFR</w:t>
+            </w:r>
+          </w:p>
+        </w:tc>
+        <w:tc>
+          <w:tcPr>
+            <w:tcW w:w="0" w:type="auto"/>
+            <w:vAlign w:val="center"/>
+            <w:hideMark/>
+          </w:tcPr>
+          <w:p>
+            <w:r>
+              <w:t>9</w:t>
+            </w:r>
+          </w:p>
+        </w:tc>
+        <w:tc>
+          <w:tcPr>
+            <w:tcW w:w="0" w:type="auto"/>
+            <w:vAlign w:val="center"/>
+            <w:hideMark/>
+          </w:tcPr>
+          <w:p>
+            <w:r>
+              <w:t>8</w:t>
+            </w:r>
+          </w:p>
+        </w:tc>
+        <w:tc>
+          <w:tcPr>
+            <w:tcW w:w="0" w:type="auto"/>
+            <w:vAlign w:val="center"/>
+            <w:hideMark/>
+          </w:tcPr>
+          <w:p>
+            <w:r>
+              <w:t>6</w:t>
+            </w:r>
+          </w:p>
+        </w:tc>
+      </w:tr>
+    </w:tbl>
+    <w:p>
+      <w:pPr>
+        <w:rPr>
+          <w:lang w:val="en-GB"/>
+        </w:rPr>
+      </w:pPr>
+      <w:r>
+        <w:rPr>
+          <w:lang w:val="en-GB"/>
+        </w:rPr>
+        <w:t>Then these aggregated infrastructure indicators can be attached to the QoS measurements.</w:t>
+      </w:r>
+    </w:p>
+    <w:p>
+      <w:pPr>
+        <w:rPr>
+          <w:lang w:val="en-GB"/>
+        </w:rPr>
+      </w:pPr>
+      <w:r>
+        <w:rPr>
+          <w:lang w:val="en-GB"/>
+        </w:rPr>
+        <w:t>Our denormalized BigQuery table will therefore combine:</w:t>
+      </w:r>
+    </w:p>
+    <w:p>
+      <w:r>
+        <w:t>QoS</w:t>
+      </w:r>
+    </w:p>
+    <w:p>
+      <w:pPr>
+        <w:numPr>
+          <w:ilvl w:val="0"/>
+          <w:numId w:val="8"/>
+        </w:numPr>
+      </w:pPr>
+      <w:proofErr w:type="gramStart"/>
+      <w:r>
+        <w:lastRenderedPageBreak/>
+        <w:t>date</w:t>
+      </w:r>
+      <w:proofErr w:type="gramEnd"/>
+      <w:r>
+        <w:t xml:space="preserve">/time </w:t>
+      </w:r>
+    </w:p>
+    <w:p>
+      <w:pPr>
+        <w:numPr>
+          <w:ilvl w:val="0"/>
+          <w:numId w:val="8"/>
+        </w:numPr>
+      </w:pPr>
+      <w:proofErr w:type="spellStart"/>
+      <w:proofErr w:type="gramStart"/>
+      <w:r>
+        <w:t>protocol</w:t>
+      </w:r>
+      <w:proofErr w:type="spellEnd"/>
+      <w:proofErr w:type="gramEnd"/>
+      <w:r>
+        <w:t xml:space="preserve"> </w:t>
+      </w:r>
+    </w:p>
+    <w:p>
+      <w:pPr>
+        <w:numPr>
+          <w:ilvl w:val="0"/>
+          <w:numId w:val="8"/>
+        </w:numPr>
+      </w:pPr>
+      <w:proofErr w:type="spellStart"/>
+      <w:proofErr w:type="gramStart"/>
+      <w:r>
+        <w:t>operator</w:t>
+      </w:r>
+      <w:proofErr w:type="spellEnd"/>
+      <w:proofErr w:type="gramEnd"/>
+      <w:r>
+        <w:t xml:space="preserve"> </w:t>
+      </w:r>
+    </w:p>
+    <w:p>
+      <w:pPr>
+        <w:numPr>
+          <w:ilvl w:val="0"/>
+          <w:numId w:val="8"/>
+        </w:numPr>
+      </w:pPr>
+      <w:proofErr w:type="gramStart"/>
+      <w:r>
+        <w:t>performance</w:t>
+      </w:r>
+      <w:proofErr w:type="gramEnd"/>
+      <w:r>
+        <w:t xml:space="preserve"> KPIs </w:t>
+      </w:r>
+    </w:p>
+    <w:p>
+      <w:pPr>
+        <w:numPr>
+          <w:ilvl w:val="0"/>
+          <w:numId w:val="8"/>
+        </w:numPr>
+      </w:pPr>
+      <w:r>
+        <w:t xml:space="preserve">RSRP/RSRQ </w:t>
+      </w:r>
+    </w:p>
+    <w:p>
+      <w:pPr>
+        <w:numPr>
+          <w:ilvl w:val="0"/>
+          <w:numId w:val="8"/>
+        </w:numPr>
+      </w:pPr>
+      <w:r>
+        <w:t xml:space="preserve">URL </w:t>
+      </w:r>
+    </w:p>
+    <w:p>
+      <w:pPr>
+        <w:numPr>
+          <w:ilvl w:val="0"/>
+          <w:numId w:val="8"/>
+        </w:numPr>
+      </w:pPr>
+      <w:proofErr w:type="gramStart"/>
+      <w:r>
+        <w:t>location</w:t>
+      </w:r>
+      <w:proofErr w:type="gramEnd"/>
+      <w:r>
+        <w:t>/</w:t>
+      </w:r>
+      <w:proofErr w:type="spellStart"/>
+      <w:r>
+        <w:t>context</w:t>
+      </w:r>
+      <w:proofErr w:type="spellEnd"/>
+      <w:r>
+        <w:t xml:space="preserve"> </w:t>
+      </w:r>
+    </w:p>
+    <w:p>
+      <w:proofErr w:type="spellStart"/>
+      <w:r>
+        <w:t>Geography</w:t>
+      </w:r>
+      <w:proofErr w:type="spellEnd"/>
+    </w:p>
+    <w:p>
+      <w:pPr>
+        <w:numPr>
+          <w:ilvl w:val="0"/>
+          <w:numId w:val="9"/>
+        </w:numPr>
+      </w:pPr>
+      <w:proofErr w:type="gramStart"/>
+      <w:r>
+        <w:t>commune</w:t>
+      </w:r>
+      <w:proofErr w:type="gramEnd"/>
+      <w:r>
+        <w:t xml:space="preserve"> </w:t>
+      </w:r>
+    </w:p>
+    <w:p>
+      <w:pPr>
+        <w:numPr>
+          <w:ilvl w:val="0"/>
+          <w:numId w:val="9"/>
+        </w:numPr>
+      </w:pPr>
+      <w:proofErr w:type="spellStart"/>
+      <w:proofErr w:type="gramStart"/>
+      <w:r>
+        <w:t>department</w:t>
+      </w:r>
+      <w:proofErr w:type="spellEnd"/>
+      <w:proofErr w:type="gramEnd"/>
+      <w:r>
+        <w:t xml:space="preserve"> </w:t>
+      </w:r>
+    </w:p>
+    <w:p>
+      <w:pPr>
+        <w:numPr>
+          <w:ilvl w:val="0"/>
+          <w:numId w:val="9"/>
+        </w:numPr>
+      </w:pPr>
+      <w:proofErr w:type="spellStart"/>
+      <w:proofErr w:type="gramStart"/>
+      <w:r>
+        <w:t>region</w:t>
+      </w:r>
+      <w:proofErr w:type="spellEnd"/>
+      <w:proofErr w:type="gramEnd"/>
+      <w:r>
+        <w:t xml:space="preserve"> </w:t>
+      </w:r>
+    </w:p>
+    <w:p>
+      <w:r>
+        <w:t>Infrastructure</w:t>
+      </w:r>
+    </w:p>
+    <w:p>
+      <w:pPr>
+        <w:numPr>
+          <w:ilvl w:val="0"/>
+          <w:numId w:val="10"/>
+        </w:numPr>
+      </w:pPr>
+      <w:proofErr w:type="spellStart"/>
+      <w:proofErr w:type="gramStart"/>
+      <w:r>
+        <w:t>number</w:t>
+      </w:r>
+      <w:proofErr w:type="spellEnd"/>
+      <w:proofErr w:type="gramEnd"/>
+      <w:r>
+        <w:t xml:space="preserve"> of sites </w:t>
+      </w:r>
+    </w:p>
+    <w:p>
+      <w:pPr>
+        <w:numPr>
+          <w:ilvl w:val="0"/>
+          <w:numId w:val="10"/>
+        </w:numPr>
+      </w:pPr>
+      <w:proofErr w:type="spellStart"/>
+      <w:proofErr w:type="gramStart"/>
+      <w:r>
+        <w:t>number</w:t>
+      </w:r>
+      <w:proofErr w:type="spellEnd"/>
+      <w:proofErr w:type="gramEnd"/>
+      <w:r>
+        <w:t xml:space="preserve"> of 4G sites </w:t>
+      </w:r>
+    </w:p>
+    <w:p>
+      <w:pPr>
+        <w:numPr>
+          <w:ilvl w:val="0"/>
+          <w:numId w:val="10"/>
+        </w:numPr>
+      </w:pPr>
+      <w:proofErr w:type="spellStart"/>
+      <w:proofErr w:type="gramStart"/>
+      <w:r>
+        <w:t>number</w:t>
+      </w:r>
+      <w:proofErr w:type="spellEnd"/>
+      <w:proofErr w:type="gramEnd"/>
+      <w:r>
+        <w:t xml:space="preserve"> of 5G sites </w:t>
+      </w:r>
+    </w:p>
+    <w:p>
+      <w:pPr>
+        <w:numPr>
+          <w:ilvl w:val="0"/>
+          <w:numId w:val="10"/>
+        </w:numPr>
+      </w:pPr>
+      <w:proofErr w:type="spellStart"/>
+      <w:proofErr w:type="gramStart"/>
+      <w:r>
+        <w:t>potentially</w:t>
+      </w:r>
+      <w:proofErr w:type="spellEnd"/>
+      <w:proofErr w:type="gramEnd"/>
+      <w:r>
+        <w:t xml:space="preserve"> 5G </w:t>
+      </w:r>
+      <w:proofErr w:type="spellStart"/>
+      <w:r>
+        <w:t>frequency</w:t>
+      </w:r>
+      <w:proofErr w:type="spellEnd"/>
+      <w:r>
+        <w:t xml:space="preserve"> </w:t>
+      </w:r>
+      <w:proofErr w:type="spellStart"/>
+      <w:r>
+        <w:t>counts</w:t>
+      </w:r>
+      <w:proofErr w:type="spellEnd"/>
+      <w:r>
+        <w:t xml:space="preserve"> </w:t>
+      </w:r>
+    </w:p>
+    <w:p>
+      <w:proofErr w:type="spellStart"/>
+      <w:proofErr w:type="gramStart"/>
+      <w:r>
+        <w:t>Conceptually</w:t>
+      </w:r>
+      <w:proofErr w:type="spellEnd"/>
+      <w:r>
+        <w:t>:</w:t>
+      </w:r>
+      <w:proofErr w:type="gramEnd"/>
+    </w:p>
+    <w:p>
+      <w:r>
+        <w:t>FACT_QOS</w:t>
+      </w:r>
+    </w:p>
+    <w:p>
+      <w:r>
+        <w:t xml:space="preserve">    │</w:t>
+      </w:r>
+    </w:p>
+    <w:p>
+      <w:r>
+        <w:t xml:space="preserve">    </w:t>
+      </w:r>
+      <w:r>
+        <w:rPr>
+          <w:rFonts w:ascii="MS Gothic" w:eastAsia="MS Gothic" w:hAnsi="MS Gothic" w:cs="MS Gothic" w:hint="eastAsia"/>
+        </w:rPr>
+        <w:t>├</w:t>
+      </w:r>
+      <w:r>
+        <w:rPr>
+          <w:rFonts w:ascii="Aptos" w:hAnsi="Aptos" w:cs="Aptos"/>
+        </w:rPr>
+        <w:t>──</w:t>
+      </w:r>
+      <w:r>
+        <w:t xml:space="preserve"> </w:t>
+      </w:r>
+      <w:proofErr w:type="spellStart"/>
+      <w:r>
+        <w:t>operator</w:t>
+      </w:r>
+      <w:proofErr w:type="spellEnd"/>
+      <w:r>
+        <w:t xml:space="preserve"> information</w:t>
+      </w:r>
+    </w:p>
+    <w:p>
+      <w:r>
+        <w:t xml:space="preserve">    </w:t>
+      </w:r>
+      <w:r>
+        <w:rPr>
+          <w:rFonts w:ascii="MS Gothic" w:eastAsia="MS Gothic" w:hAnsi="MS Gothic" w:cs="MS Gothic" w:hint="eastAsia"/>
+        </w:rPr>
+        <w:t>├</w:t>
+      </w:r>
+      <w:r>
+        <w:rPr>
+          <w:rFonts w:ascii="Aptos" w:hAnsi="Aptos" w:cs="Aptos"/>
+        </w:rPr>
+        <w:t>──</w:t>
+      </w:r>
+      <w:r>
+        <w:t xml:space="preserve"> </w:t>
+      </w:r>
+      <w:proofErr w:type="spellStart"/>
+      <w:r>
+        <w:t>protocol</w:t>
+      </w:r>
+      <w:proofErr w:type="spellEnd"/>
+      <w:r>
+        <w:t xml:space="preserve"> information</w:t>
+      </w:r>
+    </w:p>
+    <w:p>
+      <w:r>
+        <w:t xml:space="preserve">    </w:t>
+      </w:r>
+      <w:r>
+        <w:rPr>
+          <w:rFonts w:ascii="MS Gothic" w:eastAsia="MS Gothic" w:hAnsi="MS Gothic" w:cs="MS Gothic" w:hint="eastAsia"/>
+        </w:rPr>
+        <w:t>├</w:t>
+      </w:r>
+      <w:r>
+        <w:rPr>
+          <w:rFonts w:ascii="Aptos" w:hAnsi="Aptos" w:cs="Aptos"/>
+        </w:rPr>
+        <w:t>──</w:t>
+      </w:r>
+      <w:r>
+        <w:t xml:space="preserve"> </w:t>
+      </w:r>
+      <w:proofErr w:type="spellStart"/>
+      <w:r>
+        <w:t>geographic</w:t>
+      </w:r>
+      <w:proofErr w:type="spellEnd"/>
+      <w:r>
+        <w:t xml:space="preserve"> information</w:t>
+      </w:r>
+    </w:p>
+    <w:p>
+      <w:r>
+        <w:t xml:space="preserve">    │</w:t>
+      </w:r>
+    </w:p>
+    <w:p>
+      <w:r>
+        <w:t xml:space="preserve">    └── JOIN</w:t>
+      </w:r>
+    </w:p>
+    <w:p>
+      <w:r>
+        <w:t xml:space="preserve">          │</w:t>
+      </w:r>
+    </w:p>
+    <w:p>
+      <w:r>
+        <w:t xml:space="preserve">          </w:t>
+      </w:r>
+      <w:r>
+        <w:rPr>
+          <w:rFonts w:ascii="Arial" w:hAnsi="Arial" w:cs="Arial"/>
+        </w:rPr>
+        <w:t>▼</w:t>
+      </w:r>
+    </w:p>
+    <w:p>
+      <w:r>
+        <w:t xml:space="preserve">   </w:t>
+      </w:r>
+      <w:proofErr w:type="spellStart"/>
+      <w:proofErr w:type="gramStart"/>
+      <w:r>
+        <w:t>aggregated</w:t>
+      </w:r>
+      <w:proofErr w:type="spellEnd"/>
+      <w:proofErr w:type="gramEnd"/>
+      <w:r>
+        <w:t xml:space="preserve"> SITES</w:t>
+      </w:r>
+    </w:p>
+    <w:p>
+      <w:r>
+        <w:t xml:space="preserve">   (</w:t>
+      </w:r>
+      <w:proofErr w:type="gramStart"/>
+      <w:r>
+        <w:t>commune</w:t>
+      </w:r>
+      <w:proofErr w:type="gramEnd"/>
+      <w:r>
+        <w:t xml:space="preserve"> + </w:t>
+      </w:r>
+      <w:proofErr w:type="spellStart"/>
+      <w:r>
+        <w:t>operator</w:t>
+      </w:r>
+      <w:proofErr w:type="spellEnd"/>
+      <w:r>
+        <w:t>)</w:t>
+      </w:r>
+    </w:p>
+    <w:p>
+      <w:pPr>
+        <w:rPr>
+          <w:lang w:val="en-GB"/>
+        </w:rPr>
+      </w:pPr>
+      <w:r>
+        <w:rPr>
+          <w:lang w:val="en-GB"/>
+        </w:rPr>
+        <w:lastRenderedPageBreak/>
+        <w:t xml:space="preserve">This gives us a single denormalized table suitable for </w:t>
+      </w:r>
+      <w:proofErr w:type="spellStart"/>
+      <w:r>
+        <w:rPr>
+          <w:lang w:val="en-GB"/>
+        </w:rPr>
+        <w:t>BigQuery</w:t>
+      </w:r>
+      <w:proofErr w:type="spellEnd"/>
+      <w:r>
+        <w:rPr>
+          <w:lang w:val="en-GB"/>
+        </w:rPr>
+        <w:t>.</w:t>
+      </w:r>
+    </w:p>
+    <w:p>
+      <w:pPr>
+        <w:rPr>
+          <w:lang w:val="en-GB"/>
+        </w:rPr>
+      </w:pPr>
+      <w:r>
+        <w:rPr>
+          <w:lang w:val="en-GB"/>
+        </w:rPr>
+        <w:t>One important choice</w:t>
+      </w:r>
+    </w:p>
+    <w:p>
+      <w:pPr>
+        <w:rPr>
+          <w:lang w:val="en-GB"/>
+        </w:rPr>
+      </w:pPr>
+      <w:r>
+        <w:rPr>
+          <w:lang w:val="en-GB"/>
+        </w:rPr>
+        <w:t xml:space="preserve">For the </w:t>
+      </w:r>
+      <w:proofErr w:type="spellStart"/>
+      <w:r>
+        <w:rPr>
+          <w:lang w:val="en-GB"/>
+        </w:rPr>
+        <w:t>BigQuery</w:t>
+      </w:r>
+      <w:proofErr w:type="spellEnd"/>
+      <w:r>
+        <w:rPr>
+          <w:lang w:val="en-GB"/>
+        </w:rPr>
+        <w:t xml:space="preserve"> version, I recommend:</w:t>
+      </w:r>
+    </w:p>
+    <w:p>
+      <w:pPr>
+        <w:rPr>
+          <w:lang w:val="en-GB"/>
+        </w:rPr>
+      </w:pPr>
+      <w:r>
+        <w:rPr>
+          <w:lang w:val="en-GB"/>
+        </w:rPr>
+        <w:t xml:space="preserve">Partition </w:t>
+      </w:r>
+      <w:proofErr w:type="gramStart"/>
+      <w:r>
+        <w:rPr>
+          <w:lang w:val="en-GB"/>
+        </w:rPr>
+        <w:t>by:</w:t>
+      </w:r>
+      <w:proofErr w:type="gramEnd"/>
+      <w:r>
+        <w:rPr>
+          <w:lang w:val="en-GB"/>
+        </w:rPr>
+        <w:t xml:space="preserve"> </w:t>
+      </w:r>
+      <w:proofErr w:type="spellStart"/>
+      <w:r>
+        <w:rPr>
+          <w:lang w:val="en-GB"/>
+        </w:rPr>
+        <w:t>date_start</w:t>
+      </w:r>
+      <w:proofErr w:type="spellEnd"/>
+    </w:p>
+    <w:p>
+      <w:pPr>
+        <w:rPr>
+          <w:lang w:val="en-GB"/>
+        </w:rPr>
+      </w:pPr>
+      <w:r>
+        <w:rPr>
+          <w:lang w:val="en-GB"/>
+        </w:rPr>
+        <w:t xml:space="preserve">Cluster </w:t>
+      </w:r>
+      <w:proofErr w:type="gramStart"/>
+      <w:r>
+        <w:rPr>
+          <w:lang w:val="en-GB"/>
+        </w:rPr>
+        <w:t>by:</w:t>
+      </w:r>
+      <w:proofErr w:type="gramEnd"/>
+      <w:r>
+        <w:rPr>
+          <w:lang w:val="en-GB"/>
+        </w:rPr>
+        <w:t xml:space="preserve"> </w:t>
+      </w:r>
+      <w:proofErr w:type="spellStart"/>
+      <w:r>
+        <w:rPr>
+          <w:lang w:val="en-GB"/>
+        </w:rPr>
+        <w:t>operator_id</w:t>
+      </w:r>
+      <w:proofErr w:type="spellEnd"/>
+      <w:r>
+        <w:rPr>
+          <w:lang w:val="en-GB"/>
+        </w:rPr>
+        <w:t xml:space="preserve">, </w:t>
+      </w:r>
+      <w:proofErr w:type="spellStart"/>
+      <w:r>
+        <w:rPr>
+          <w:lang w:val="en-GB"/>
+        </w:rPr>
+        <w:t>protocol_id</w:t>
+      </w:r>
+      <w:proofErr w:type="spellEnd"/>
+      <w:r>
+        <w:rPr>
+          <w:lang w:val="en-GB"/>
+        </w:rPr>
+        <w:t xml:space="preserve">, </w:t>
+      </w:r>
+      <w:proofErr w:type="spellStart"/>
+      <w:r>
+        <w:rPr>
+          <w:lang w:val="en-GB"/>
+        </w:rPr>
+        <w:t>insee_com</w:t>
+      </w:r>
+      <w:proofErr w:type="spellEnd"/>
+    </w:p>
+    <w:p>
+      <w:pPr>
+        <w:rPr>
+          <w:lang w:val="en-GB"/>
+        </w:rPr>
+      </w:pPr>
+      <w:r>
+        <w:rPr>
+          <w:lang w:val="en-GB"/>
+        </w:rPr>
+        <w:t>That will also give you something concrete to explain in the RNCP presentation: why partitioning and clustering were chosen.</w:t>
+      </w:r>
+    </w:p>
+    <w:p>
+      <w:pPr>
+        <w:rPr>
+          <w:lang w:val="en-GB"/>
+        </w:rPr>
+      </w:pPr>
+      <w:r>
+        <w:rPr>
+          <w:lang w:val="en-GB"/>
+        </w:rPr>
+        <w:t>Don't create the table yet.</w:t>
+      </w:r>
+    </w:p>
+    <w:p>
+      <w:pPr>
+        <w:rPr>
+          <w:b/>
+          <w:bCs/>
+          <w:lang w:val="en-GB"/>
+        </w:rPr>
+      </w:pPr>
     </w:p>
     <w:p>
       <w:pPr>
@@ -1037,6 +3819,123 @@
     </w:lvl>
   </w:abstractNum>
   <w:abstractNum w:abstractNumId="2" w15:restartNumberingAfterBreak="0">
+    <w:nsid w:val="2D584424"/>
+    <w:multiLevelType w:val="multilevel"/>
+    <w:tmpl w:val="B5F62FFA"/>
+    <w:lvl w:ilvl="0">
+      <w:start w:val="1"/>
+      <w:numFmt w:val="decimal"/>
+      <w:lvlText w:val="%1."/>
+      <w:lvlJc w:val="left"/>
+      <w:pPr>
+        <w:tabs>
+          <w:tab w:val="num" w:pos="720"/>
+        </w:tabs>
+        <w:ind w:left="720" w:hanging="360"/>
+      </w:pPr>
+    </w:lvl>
+    <w:lvl w:ilvl="1">
+      <w:start w:val="1"/>
+      <w:numFmt w:val="bullet"/>
+      <w:lvlText w:val="o"/>
+      <w:lvlJc w:val="left"/>
+      <w:pPr>
+        <w:tabs>
+          <w:tab w:val="num" w:pos="1440"/>
+        </w:tabs>
+        <w:ind w:left="1440" w:hanging="360"/>
+      </w:pPr>
+      <w:rPr>
+        <w:rFonts w:ascii="Courier New" w:hAnsi="Courier New" w:hint="default"/>
+        <w:sz w:val="20"/>
+      </w:rPr>
+    </w:lvl>
+    <w:lvl w:ilvl="2" w:tentative="1">
+      <w:start w:val="1"/>
+      <w:numFmt w:val="decimal"/>
+      <w:lvlText w:val="%3."/>
+      <w:lvlJc w:val="left"/>
+      <w:pPr>
+        <w:tabs>
+          <w:tab w:val="num" w:pos="2160"/>
+        </w:tabs>
+        <w:ind w:left="2160" w:hanging="360"/>
+      </w:pPr>
+    </w:lvl>
+    <w:lvl w:ilvl="3" w:tentative="1">
+      <w:start w:val="1"/>
+      <w:numFmt w:val="decimal"/>
+      <w:lvlText w:val="%4."/>
+      <w:lvlJc w:val="left"/>
+      <w:pPr>
+        <w:tabs>
+          <w:tab w:val="num" w:pos="2880"/>
+        </w:tabs>
+        <w:ind w:left="2880" w:hanging="360"/>
+      </w:pPr>
+    </w:lvl>
+    <w:lvl w:ilvl="4" w:tentative="1">
+      <w:start w:val="1"/>
+      <w:numFmt w:val="decimal"/>
+      <w:lvlText w:val="%5."/>
+      <w:lvlJc w:val="left"/>
+      <w:pPr>
+        <w:tabs>
+          <w:tab w:val="num" w:pos="3600"/>
+        </w:tabs>
+        <w:ind w:left="3600" w:hanging="360"/>
+      </w:pPr>
+    </w:lvl>
+    <w:lvl w:ilvl="5" w:tentative="1">
+      <w:start w:val="1"/>
+      <w:numFmt w:val="decimal"/>
+      <w:lvlText w:val="%6."/>
+      <w:lvlJc w:val="left"/>
+      <w:pPr>
+        <w:tabs>
+          <w:tab w:val="num" w:pos="4320"/>
+        </w:tabs>
+        <w:ind w:left="4320" w:hanging="360"/>
+      </w:pPr>
+    </w:lvl>
+    <w:lvl w:ilvl="6" w:tentative="1">
+      <w:start w:val="1"/>
+      <w:numFmt w:val="decimal"/>
+      <w:lvlText w:val="%7."/>
+      <w:lvlJc w:val="left"/>
+      <w:pPr>
+        <w:tabs>
+          <w:tab w:val="num" w:pos="5040"/>
+        </w:tabs>
+        <w:ind w:left="5040" w:hanging="360"/>
+      </w:pPr>
+    </w:lvl>
+    <w:lvl w:ilvl="7" w:tentative="1">
+      <w:start w:val="1"/>
+      <w:numFmt w:val="decimal"/>
+      <w:lvlText w:val="%8."/>
+      <w:lvlJc w:val="left"/>
+      <w:pPr>
+        <w:tabs>
+          <w:tab w:val="num" w:pos="5760"/>
+        </w:tabs>
+        <w:ind w:left="5760" w:hanging="360"/>
+      </w:pPr>
+    </w:lvl>
+    <w:lvl w:ilvl="8" w:tentative="1">
+      <w:start w:val="1"/>
+      <w:numFmt w:val="decimal"/>
+      <w:lvlText w:val="%9."/>
+      <w:lvlJc w:val="left"/>
+      <w:pPr>
+        <w:tabs>
+          <w:tab w:val="num" w:pos="6480"/>
+        </w:tabs>
+        <w:ind w:left="6480" w:hanging="360"/>
+      </w:pPr>
+    </w:lvl>
+  </w:abstractNum>
+  <w:abstractNum w:abstractNumId="3" w15:restartNumberingAfterBreak="0">
     <w:nsid w:val="33225933"/>
     <w:multiLevelType w:val="multilevel"/>
     <w:tmpl w:val="8586FE94"/>
@@ -1185,7 +4084,7 @@
       </w:rPr>
     </w:lvl>
   </w:abstractNum>
-  <w:abstractNum w:abstractNumId="3" w15:restartNumberingAfterBreak="0">
+  <w:abstractNum w:abstractNumId="4" w15:restartNumberingAfterBreak="0">
     <w:nsid w:val="35937FC3"/>
     <w:multiLevelType w:val="multilevel"/>
     <w:tmpl w:val="5908DD9E"/>
@@ -1334,7 +4233,156 @@
       </w:rPr>
     </w:lvl>
   </w:abstractNum>
-  <w:abstractNum w:abstractNumId="4" w15:restartNumberingAfterBreak="0">
+  <w:abstractNum w:abstractNumId="5" w15:restartNumberingAfterBreak="0">
+    <w:nsid w:val="45191D6D"/>
+    <w:multiLevelType w:val="multilevel"/>
+    <w:tmpl w:val="2896702A"/>
+    <w:lvl w:ilvl="0">
+      <w:start w:val="1"/>
+      <w:numFmt w:val="bullet"/>
+      <w:lvlText w:val=""/>
+      <w:lvlJc w:val="left"/>
+      <w:pPr>
+        <w:tabs>
+          <w:tab w:val="num" w:pos="720"/>
+        </w:tabs>
+        <w:ind w:left="720" w:hanging="360"/>
+      </w:pPr>
+      <w:rPr>
+        <w:rFonts w:ascii="Symbol" w:hAnsi="Symbol" w:hint="default"/>
+        <w:sz w:val="20"/>
+      </w:rPr>
+    </w:lvl>
+    <w:lvl w:ilvl="1" w:tentative="1">
+      <w:start w:val="1"/>
+      <w:numFmt w:val="bullet"/>
+      <w:lvlText w:val="o"/>
+      <w:lvlJc w:val="left"/>
+      <w:pPr>
+        <w:tabs>
+          <w:tab w:val="num" w:pos="1440"/>
+        </w:tabs>
+        <w:ind w:left="1440" w:hanging="360"/>
+      </w:pPr>
+      <w:rPr>
+        <w:rFonts w:ascii="Courier New" w:hAnsi="Courier New" w:hint="default"/>
+        <w:sz w:val="20"/>
+      </w:rPr>
+    </w:lvl>
+    <w:lvl w:ilvl="2" w:tentative="1">
+      <w:start w:val="1"/>
+      <w:numFmt w:val="bullet"/>
+      <w:lvlText w:val=""/>
+      <w:lvlJc w:val="left"/>
+      <w:pPr>
+        <w:tabs>
+          <w:tab w:val="num" w:pos="2160"/>
+        </w:tabs>
+        <w:ind w:left="2160" w:hanging="360"/>
+      </w:pPr>
+      <w:rPr>
+        <w:rFonts w:ascii="Wingdings" w:hAnsi="Wingdings" w:hint="default"/>
+        <w:sz w:val="20"/>
+      </w:rPr>
+    </w:lvl>
+    <w:lvl w:ilvl="3" w:tentative="1">
+      <w:start w:val="1"/>
+      <w:numFmt w:val="bullet"/>
+      <w:lvlText w:val=""/>
+      <w:lvlJc w:val="left"/>
+      <w:pPr>
+        <w:tabs>
+          <w:tab w:val="num" w:pos="2880"/>
+        </w:tabs>
+        <w:ind w:left="2880" w:hanging="360"/>
+      </w:pPr>
+      <w:rPr>
+        <w:rFonts w:ascii="Wingdings" w:hAnsi="Wingdings" w:hint="default"/>
+        <w:sz w:val="20"/>
+      </w:rPr>
+    </w:lvl>
+    <w:lvl w:ilvl="4" w:tentative="1">
+      <w:start w:val="1"/>
+      <w:numFmt w:val="bullet"/>
+      <w:lvlText w:val=""/>
+      <w:lvlJc w:val="left"/>
+      <w:pPr>
+        <w:tabs>
+          <w:tab w:val="num" w:pos="3600"/>
+        </w:tabs>
+        <w:ind w:left="3600" w:hanging="360"/>
+      </w:pPr>
+      <w:rPr>
+        <w:rFonts w:ascii="Wingdings" w:hAnsi="Wingdings" w:hint="default"/>
+        <w:sz w:val="20"/>
+      </w:rPr>
+    </w:lvl>
+    <w:lvl w:ilvl="5" w:tentative="1">
+      <w:start w:val="1"/>
+      <w:numFmt w:val="bullet"/>
+      <w:lvlText w:val=""/>
+      <w:lvlJc w:val="left"/>
+      <w:pPr>
+        <w:tabs>
+          <w:tab w:val="num" w:pos="4320"/>
+        </w:tabs>
+        <w:ind w:left="4320" w:hanging="360"/>
+      </w:pPr>
+      <w:rPr>
+        <w:rFonts w:ascii="Wingdings" w:hAnsi="Wingdings" w:hint="default"/>
+        <w:sz w:val="20"/>
+      </w:rPr>
+    </w:lvl>
+    <w:lvl w:ilvl="6" w:tentative="1">
+      <w:start w:val="1"/>
+      <w:numFmt w:val="bullet"/>
+      <w:lvlText w:val=""/>
+      <w:lvlJc w:val="left"/>
+      <w:pPr>
+        <w:tabs>
+          <w:tab w:val="num" w:pos="5040"/>
+        </w:tabs>
+        <w:ind w:left="5040" w:hanging="360"/>
+      </w:pPr>
+      <w:rPr>
+        <w:rFonts w:ascii="Wingdings" w:hAnsi="Wingdings" w:hint="default"/>
+        <w:sz w:val="20"/>
+      </w:rPr>
+    </w:lvl>
+    <w:lvl w:ilvl="7" w:tentative="1">
+      <w:start w:val="1"/>
+      <w:numFmt w:val="bullet"/>
+      <w:lvlText w:val=""/>
+      <w:lvlJc w:val="left"/>
+      <w:pPr>
+        <w:tabs>
+          <w:tab w:val="num" w:pos="5760"/>
+        </w:tabs>
+        <w:ind w:left="5760" w:hanging="360"/>
+      </w:pPr>
+      <w:rPr>
+        <w:rFonts w:ascii="Wingdings" w:hAnsi="Wingdings" w:hint="default"/>
+        <w:sz w:val="20"/>
+      </w:rPr>
+    </w:lvl>
+    <w:lvl w:ilvl="8" w:tentative="1">
+      <w:start w:val="1"/>
+      <w:numFmt w:val="bullet"/>
+      <w:lvlText w:val=""/>
+      <w:lvlJc w:val="left"/>
+      <w:pPr>
+        <w:tabs>
+          <w:tab w:val="num" w:pos="6480"/>
+        </w:tabs>
+        <w:ind w:left="6480" w:hanging="360"/>
+      </w:pPr>
+      <w:rPr>
+        <w:rFonts w:ascii="Wingdings" w:hAnsi="Wingdings" w:hint="default"/>
+        <w:sz w:val="20"/>
+      </w:rPr>
+    </w:lvl>
+  </w:abstractNum>
+  <w:abstractNum w:abstractNumId="6" w15:restartNumberingAfterBreak="0">
     <w:nsid w:val="467D7FDA"/>
     <w:multiLevelType w:val="multilevel"/>
     <w:tmpl w:val="21727C9A"/>
@@ -1483,7 +4531,305 @@
       </w:rPr>
     </w:lvl>
   </w:abstractNum>
-  <w:abstractNum w:abstractNumId="5" w15:restartNumberingAfterBreak="0">
+  <w:abstractNum w:abstractNumId="7" w15:restartNumberingAfterBreak="0">
+    <w:nsid w:val="4AE91D02"/>
+    <w:multiLevelType w:val="multilevel"/>
+    <w:tmpl w:val="1B10B2A4"/>
+    <w:lvl w:ilvl="0">
+      <w:start w:val="1"/>
+      <w:numFmt w:val="bullet"/>
+      <w:lvlText w:val=""/>
+      <w:lvlJc w:val="left"/>
+      <w:pPr>
+        <w:tabs>
+          <w:tab w:val="num" w:pos="720"/>
+        </w:tabs>
+        <w:ind w:left="720" w:hanging="360"/>
+      </w:pPr>
+      <w:rPr>
+        <w:rFonts w:ascii="Symbol" w:hAnsi="Symbol" w:hint="default"/>
+        <w:sz w:val="20"/>
+      </w:rPr>
+    </w:lvl>
+    <w:lvl w:ilvl="1" w:tentative="1">
+      <w:start w:val="1"/>
+      <w:numFmt w:val="bullet"/>
+      <w:lvlText w:val="o"/>
+      <w:lvlJc w:val="left"/>
+      <w:pPr>
+        <w:tabs>
+          <w:tab w:val="num" w:pos="1440"/>
+        </w:tabs>
+        <w:ind w:left="1440" w:hanging="360"/>
+      </w:pPr>
+      <w:rPr>
+        <w:rFonts w:ascii="Courier New" w:hAnsi="Courier New" w:hint="default"/>
+        <w:sz w:val="20"/>
+      </w:rPr>
+    </w:lvl>
+    <w:lvl w:ilvl="2" w:tentative="1">
+      <w:start w:val="1"/>
+      <w:numFmt w:val="bullet"/>
+      <w:lvlText w:val=""/>
+      <w:lvlJc w:val="left"/>
+      <w:pPr>
+        <w:tabs>
+          <w:tab w:val="num" w:pos="2160"/>
+        </w:tabs>
+        <w:ind w:left="2160" w:hanging="360"/>
+      </w:pPr>
+      <w:rPr>
+        <w:rFonts w:ascii="Wingdings" w:hAnsi="Wingdings" w:hint="default"/>
+        <w:sz w:val="20"/>
+      </w:rPr>
+    </w:lvl>
+    <w:lvl w:ilvl="3" w:tentative="1">
+      <w:start w:val="1"/>
+      <w:numFmt w:val="bullet"/>
+      <w:lvlText w:val=""/>
+      <w:lvlJc w:val="left"/>
+      <w:pPr>
+        <w:tabs>
+          <w:tab w:val="num" w:pos="2880"/>
+        </w:tabs>
+        <w:ind w:left="2880" w:hanging="360"/>
+      </w:pPr>
+      <w:rPr>
+        <w:rFonts w:ascii="Wingdings" w:hAnsi="Wingdings" w:hint="default"/>
+        <w:sz w:val="20"/>
+      </w:rPr>
+    </w:lvl>
+    <w:lvl w:ilvl="4" w:tentative="1">
+      <w:start w:val="1"/>
+      <w:numFmt w:val="bullet"/>
+      <w:lvlText w:val=""/>
+      <w:lvlJc w:val="left"/>
+      <w:pPr>
+        <w:tabs>
+          <w:tab w:val="num" w:pos="3600"/>
+        </w:tabs>
+        <w:ind w:left="3600" w:hanging="360"/>
+      </w:pPr>
+      <w:rPr>
+        <w:rFonts w:ascii="Wingdings" w:hAnsi="Wingdings" w:hint="default"/>
+        <w:sz w:val="20"/>
+      </w:rPr>
+    </w:lvl>
+    <w:lvl w:ilvl="5" w:tentative="1">
+      <w:start w:val="1"/>
+      <w:numFmt w:val="bullet"/>
+      <w:lvlText w:val=""/>
+      <w:lvlJc w:val="left"/>
+      <w:pPr>
+        <w:tabs>
+          <w:tab w:val="num" w:pos="4320"/>
+        </w:tabs>
+        <w:ind w:left="4320" w:hanging="360"/>
+      </w:pPr>
+      <w:rPr>
+        <w:rFonts w:ascii="Wingdings" w:hAnsi="Wingdings" w:hint="default"/>
+        <w:sz w:val="20"/>
+      </w:rPr>
+    </w:lvl>
+    <w:lvl w:ilvl="6" w:tentative="1">
+      <w:start w:val="1"/>
+      <w:numFmt w:val="bullet"/>
+      <w:lvlText w:val=""/>
+      <w:lvlJc w:val="left"/>
+      <w:pPr>
+        <w:tabs>
+          <w:tab w:val="num" w:pos="5040"/>
+        </w:tabs>
+        <w:ind w:left="5040" w:hanging="360"/>
+      </w:pPr>
+      <w:rPr>
+        <w:rFonts w:ascii="Wingdings" w:hAnsi="Wingdings" w:hint="default"/>
+        <w:sz w:val="20"/>
+      </w:rPr>
+    </w:lvl>
+    <w:lvl w:ilvl="7" w:tentative="1">
+      <w:start w:val="1"/>
+      <w:numFmt w:val="bullet"/>
+      <w:lvlText w:val=""/>
+      <w:lvlJc w:val="left"/>
+      <w:pPr>
+        <w:tabs>
+          <w:tab w:val="num" w:pos="5760"/>
+        </w:tabs>
+        <w:ind w:left="5760" w:hanging="360"/>
+      </w:pPr>
+      <w:rPr>
+        <w:rFonts w:ascii="Wingdings" w:hAnsi="Wingdings" w:hint="default"/>
+        <w:sz w:val="20"/>
+      </w:rPr>
+    </w:lvl>
+    <w:lvl w:ilvl="8" w:tentative="1">
+      <w:start w:val="1"/>
+      <w:numFmt w:val="bullet"/>
+      <w:lvlText w:val=""/>
+      <w:lvlJc w:val="left"/>
+      <w:pPr>
+        <w:tabs>
+          <w:tab w:val="num" w:pos="6480"/>
+        </w:tabs>
+        <w:ind w:left="6480" w:hanging="360"/>
+      </w:pPr>
+      <w:rPr>
+        <w:rFonts w:ascii="Wingdings" w:hAnsi="Wingdings" w:hint="default"/>
+        <w:sz w:val="20"/>
+      </w:rPr>
+    </w:lvl>
+  </w:abstractNum>
+  <w:abstractNum w:abstractNumId="8" w15:restartNumberingAfterBreak="0">
+    <w:nsid w:val="5AF10CAB"/>
+    <w:multiLevelType w:val="multilevel"/>
+    <w:tmpl w:val="40821B72"/>
+    <w:lvl w:ilvl="0">
+      <w:start w:val="1"/>
+      <w:numFmt w:val="bullet"/>
+      <w:lvlText w:val=""/>
+      <w:lvlJc w:val="left"/>
+      <w:pPr>
+        <w:tabs>
+          <w:tab w:val="num" w:pos="720"/>
+        </w:tabs>
+        <w:ind w:left="720" w:hanging="360"/>
+      </w:pPr>
+      <w:rPr>
+        <w:rFonts w:ascii="Symbol" w:hAnsi="Symbol" w:hint="default"/>
+        <w:sz w:val="20"/>
+      </w:rPr>
+    </w:lvl>
+    <w:lvl w:ilvl="1" w:tentative="1">
+      <w:start w:val="1"/>
+      <w:numFmt w:val="bullet"/>
+      <w:lvlText w:val="o"/>
+      <w:lvlJc w:val="left"/>
+      <w:pPr>
+        <w:tabs>
+          <w:tab w:val="num" w:pos="1440"/>
+        </w:tabs>
+        <w:ind w:left="1440" w:hanging="360"/>
+      </w:pPr>
+      <w:rPr>
+        <w:rFonts w:ascii="Courier New" w:hAnsi="Courier New" w:hint="default"/>
+        <w:sz w:val="20"/>
+      </w:rPr>
+    </w:lvl>
+    <w:lvl w:ilvl="2" w:tentative="1">
+      <w:start w:val="1"/>
+      <w:numFmt w:val="bullet"/>
+      <w:lvlText w:val=""/>
+      <w:lvlJc w:val="left"/>
+      <w:pPr>
+        <w:tabs>
+          <w:tab w:val="num" w:pos="2160"/>
+        </w:tabs>
+        <w:ind w:left="2160" w:hanging="360"/>
+      </w:pPr>
+      <w:rPr>
+        <w:rFonts w:ascii="Wingdings" w:hAnsi="Wingdings" w:hint="default"/>
+        <w:sz w:val="20"/>
+      </w:rPr>
+    </w:lvl>
+    <w:lvl w:ilvl="3" w:tentative="1">
+      <w:start w:val="1"/>
+      <w:numFmt w:val="bullet"/>
+      <w:lvlText w:val=""/>
+      <w:lvlJc w:val="left"/>
+      <w:pPr>
+        <w:tabs>
+          <w:tab w:val="num" w:pos="2880"/>
+        </w:tabs>
+        <w:ind w:left="2880" w:hanging="360"/>
+      </w:pPr>
+      <w:rPr>
+        <w:rFonts w:ascii="Wingdings" w:hAnsi="Wingdings" w:hint="default"/>
+        <w:sz w:val="20"/>
+      </w:rPr>
+    </w:lvl>
+    <w:lvl w:ilvl="4" w:tentative="1">
+      <w:start w:val="1"/>
+      <w:numFmt w:val="bullet"/>
+      <w:lvlText w:val=""/>
+      <w:lvlJc w:val="left"/>
+      <w:pPr>
+        <w:tabs>
+          <w:tab w:val="num" w:pos="3600"/>
+        </w:tabs>
+        <w:ind w:left="3600" w:hanging="360"/>
+      </w:pPr>
+      <w:rPr>
+        <w:rFonts w:ascii="Wingdings" w:hAnsi="Wingdings" w:hint="default"/>
+        <w:sz w:val="20"/>
+      </w:rPr>
+    </w:lvl>
+    <w:lvl w:ilvl="5" w:tentative="1">
+      <w:start w:val="1"/>
+      <w:numFmt w:val="bullet"/>
+      <w:lvlText w:val=""/>
+      <w:lvlJc w:val="left"/>
+      <w:pPr>
+        <w:tabs>
+          <w:tab w:val="num" w:pos="4320"/>
+        </w:tabs>
+        <w:ind w:left="4320" w:hanging="360"/>
+      </w:pPr>
+      <w:rPr>
+        <w:rFonts w:ascii="Wingdings" w:hAnsi="Wingdings" w:hint="default"/>
+        <w:sz w:val="20"/>
+      </w:rPr>
+    </w:lvl>
+    <w:lvl w:ilvl="6" w:tentative="1">
+      <w:start w:val="1"/>
+      <w:numFmt w:val="bullet"/>
+      <w:lvlText w:val=""/>
+      <w:lvlJc w:val="left"/>
+      <w:pPr>
+        <w:tabs>
+          <w:tab w:val="num" w:pos="5040"/>
+        </w:tabs>
+        <w:ind w:left="5040" w:hanging="360"/>
+      </w:pPr>
+      <w:rPr>
+        <w:rFonts w:ascii="Wingdings" w:hAnsi="Wingdings" w:hint="default"/>
+        <w:sz w:val="20"/>
+      </w:rPr>
+    </w:lvl>
+    <w:lvl w:ilvl="7" w:tentative="1">
+      <w:start w:val="1"/>
+      <w:numFmt w:val="bullet"/>
+      <w:lvlText w:val=""/>
+      <w:lvlJc w:val="left"/>
+      <w:pPr>
+        <w:tabs>
+          <w:tab w:val="num" w:pos="5760"/>
+        </w:tabs>
+        <w:ind w:left="5760" w:hanging="360"/>
+      </w:pPr>
+      <w:rPr>
+        <w:rFonts w:ascii="Wingdings" w:hAnsi="Wingdings" w:hint="default"/>
+        <w:sz w:val="20"/>
+      </w:rPr>
+    </w:lvl>
+    <w:lvl w:ilvl="8" w:tentative="1">
+      <w:start w:val="1"/>
+      <w:numFmt w:val="bullet"/>
+      <w:lvlText w:val=""/>
+      <w:lvlJc w:val="left"/>
+      <w:pPr>
+        <w:tabs>
+          <w:tab w:val="num" w:pos="6480"/>
+        </w:tabs>
+        <w:ind w:left="6480" w:hanging="360"/>
+      </w:pPr>
+      <w:rPr>
+        <w:rFonts w:ascii="Wingdings" w:hAnsi="Wingdings" w:hint="default"/>
+        <w:sz w:val="20"/>
+      </w:rPr>
+    </w:lvl>
+  </w:abstractNum>
+  <w:abstractNum w:abstractNumId="9" w15:restartNumberingAfterBreak="0">
     <w:nsid w:val="674F0D0B"/>
     <w:multiLevelType w:val="multilevel"/>
     <w:tmpl w:val="2360720C"/>
@@ -1604,19 +4950,31 @@
     <w:abstractNumId w:val="1"/>
   </w:num>
   <w:num w:numId="2" w16cid:durableId="1379478204">
-    <w:abstractNumId w:val="3"/>
+    <w:abstractNumId w:val="4"/>
   </w:num>
   <w:num w:numId="3" w16cid:durableId="1663116961">
     <w:abstractNumId w:val="0"/>
   </w:num>
   <w:num w:numId="4" w16cid:durableId="2115242380">
+    <w:abstractNumId w:val="3"/>
+  </w:num>
+  <w:num w:numId="5" w16cid:durableId="1310525151">
+    <w:abstractNumId w:val="9"/>
+  </w:num>
+  <w:num w:numId="6" w16cid:durableId="1064643648">
+    <w:abstractNumId w:val="6"/>
+  </w:num>
+  <w:num w:numId="7" w16cid:durableId="20786135">
     <w:abstractNumId w:val="2"/>
   </w:num>
-  <w:num w:numId="5" w16cid:durableId="1310525151">
+  <w:num w:numId="8" w16cid:durableId="931091149">
+    <w:abstractNumId w:val="8"/>
+  </w:num>
+  <w:num w:numId="9" w16cid:durableId="1982494112">
+    <w:abstractNumId w:val="7"/>
+  </w:num>
+  <w:num w:numId="10" w16cid:durableId="718866894">
     <w:abstractNumId w:val="5"/>
-  </w:num>
-  <w:num w:numId="6" w16cid:durableId="1064643648">
-    <w:abstractNumId w:val="4"/>
   </w:num>
 </w:numbering>
 </file>

</xml_diff>